<commit_message>
word y etiqueta colab
</commit_message>
<xml_diff>
--- a/ACTIVIDAD_3/INFORME_A3.docx
+++ b/ACTIVIDAD_3/INFORME_A3.docx
@@ -4,6 +4,7 @@
   <w:body>
     <w:p>
       <w:pPr>
+        <w:spacing w:after="0" w:line="240" w:lineRule="auto"/>
         <w:jc w:val="both"/>
         <w:rPr>
           <w:rFonts w:ascii="Calibri" w:hAnsi="Calibri" w:cs="Calibri"/>
@@ -24,6 +25,7 @@
     </w:p>
     <w:p>
       <w:pPr>
+        <w:spacing w:after="0" w:line="240" w:lineRule="auto"/>
         <w:jc w:val="both"/>
         <w:rPr>
           <w:rFonts w:ascii="Calibri" w:hAnsi="Calibri" w:cs="Calibri"/>
@@ -41,18 +43,37 @@
       </w:r>
     </w:p>
     <w:p>
-      <w:r>
-        <w:rPr>
-          <w:rFonts w:ascii="Calibri" w:hAnsi="Calibri" w:cs="Calibri"/>
-          <w:noProof/>
+      <w:pPr>
+        <w:spacing w:after="0"/>
+        <w:jc w:val="both"/>
+      </w:pPr>
+      <w:r>
+        <w:rPr>
+          <w:rFonts w:ascii="Calibri" w:hAnsi="Calibri" w:cs="Calibri"/>
           <w:sz w:val="16"/>
           <w:szCs w:val="16"/>
         </w:rPr>
         <w:drawing>
-          <wp:inline distT="0" distB="0" distL="0" distR="0" wp14:anchorId="1AECF2C1" wp14:editId="7C5EB85C">
-            <wp:extent cx="2735580" cy="1374601"/>
-            <wp:effectExtent l="0" t="0" r="7620" b="0"/>
-            <wp:docPr id="904405538" name="Imagen 1" descr="A graph showing a line&#10;&#10;Description automatically generated with medium confidence"/>
+          <wp:anchor distT="0" distB="0" distL="114300" distR="114300" simplePos="0" relativeHeight="251658240" behindDoc="0" locked="0" layoutInCell="1" allowOverlap="1" wp14:anchorId="448E7919" wp14:editId="1B6615D9">
+            <wp:simplePos x="0" y="0"/>
+            <wp:positionH relativeFrom="column">
+              <wp:posOffset>3620135</wp:posOffset>
+            </wp:positionH>
+            <wp:positionV relativeFrom="paragraph">
+              <wp:posOffset>1230366</wp:posOffset>
+            </wp:positionV>
+            <wp:extent cx="2018030" cy="1495425"/>
+            <wp:effectExtent l="0" t="0" r="1270" b="9525"/>
+            <wp:wrapThrough wrapText="bothSides">
+              <wp:wrapPolygon edited="0">
+                <wp:start x="0" y="0"/>
+                <wp:lineTo x="0" y="21462"/>
+                <wp:lineTo x="21410" y="21462"/>
+                <wp:lineTo x="21410" y="0"/>
+                <wp:lineTo x="0" y="0"/>
+              </wp:wrapPolygon>
+            </wp:wrapThrough>
+            <wp:docPr id="1729449428" name="Picture 1" descr="A graph of a red line&#10;&#10;Description automatically generated"/>
             <wp:cNvGraphicFramePr>
               <a:graphicFrameLocks xmlns:a="http://schemas.openxmlformats.org/drawingml/2006/main" noChangeAspect="1"/>
             </wp:cNvGraphicFramePr>
@@ -60,11 +81,11 @@
               <a:graphicData uri="http://schemas.openxmlformats.org/drawingml/2006/picture">
                 <pic:pic xmlns:pic="http://schemas.openxmlformats.org/drawingml/2006/picture">
                   <pic:nvPicPr>
-                    <pic:cNvPr id="904405538" name="Imagen 1" descr="A graph showing a line&#10;&#10;Description automatically generated with medium confidence"/>
+                    <pic:cNvPr id="1729449428" name="Picture 1" descr="A graph of a red line&#10;&#10;Description automatically generated"/>
                     <pic:cNvPicPr/>
                   </pic:nvPicPr>
                   <pic:blipFill>
-                    <a:blip r:embed="rId6" cstate="print">
+                    <a:blip r:embed="rId7" cstate="print">
                       <a:extLst>
                         <a:ext uri="{28A0092B-C50C-407E-A947-70E740481C1C}">
                           <a14:useLocalDpi xmlns:a14="http://schemas.microsoft.com/office/drawing/2010/main" val="0"/>
@@ -78,7 +99,7 @@
                   <pic:spPr>
                     <a:xfrm>
                       <a:off x="0" y="0"/>
-                      <a:ext cx="2735580" cy="1374601"/>
+                      <a:ext cx="2018030" cy="1495425"/>
                     </a:xfrm>
                     <a:prstGeom prst="rect">
                       <a:avLst/>
@@ -87,684 +108,21 @@
                 </pic:pic>
               </a:graphicData>
             </a:graphic>
-          </wp:inline>
+          </wp:anchor>
         </w:drawing>
       </w:r>
-    </w:p>
-    <w:p>
-      <w:pPr>
-        <w:jc w:val="both"/>
-        <w:rPr>
-          <w:rFonts w:ascii="Calibri" w:hAnsi="Calibri" w:cs="Calibri"/>
-          <w:b/>
-          <w:bCs/>
-          <w:sz w:val="16"/>
-          <w:szCs w:val="16"/>
-        </w:rPr>
-      </w:pPr>
-      <w:r>
-        <w:rPr>
-          <w:rFonts w:ascii="Calibri" w:hAnsi="Calibri" w:cs="Calibri"/>
-          <w:b/>
-          <w:bCs/>
-          <w:sz w:val="16"/>
-          <w:szCs w:val="16"/>
-        </w:rPr>
-        <w:t xml:space="preserve">Evaluación Modelos de </w:t>
-      </w:r>
-      <w:r>
-        <w:rPr>
-          <w:rFonts w:ascii="Calibri" w:hAnsi="Calibri" w:cs="Calibri"/>
-          <w:b/>
-          <w:bCs/>
-          <w:sz w:val="16"/>
-          <w:szCs w:val="16"/>
-        </w:rPr>
-        <w:t xml:space="preserve">Holt </w:t>
-      </w:r>
-      <w:proofErr w:type="spellStart"/>
-      <w:r>
-        <w:rPr>
-          <w:rFonts w:ascii="Calibri" w:hAnsi="Calibri" w:cs="Calibri"/>
-          <w:b/>
-          <w:bCs/>
-          <w:sz w:val="16"/>
-          <w:szCs w:val="16"/>
-        </w:rPr>
-        <w:t>Winters</w:t>
-      </w:r>
-      <w:proofErr w:type="spellEnd"/>
-      <w:r>
-        <w:rPr>
-          <w:rFonts w:ascii="Calibri" w:hAnsi="Calibri" w:cs="Calibri"/>
-          <w:b/>
-          <w:bCs/>
-          <w:sz w:val="16"/>
-          <w:szCs w:val="16"/>
-        </w:rPr>
-        <w:t xml:space="preserve"> </w:t>
-      </w:r>
-    </w:p>
-    <w:p>
-      <w:pPr>
-        <w:jc w:val="both"/>
-        <w:rPr>
-          <w:rFonts w:ascii="Calibri" w:hAnsi="Calibri" w:cs="Calibri"/>
-          <w:sz w:val="16"/>
-          <w:szCs w:val="16"/>
-        </w:rPr>
-      </w:pPr>
-      <w:r>
-        <w:rPr>
-          <w:rFonts w:ascii="Calibri" w:hAnsi="Calibri" w:cs="Calibri"/>
-          <w:sz w:val="16"/>
-          <w:szCs w:val="16"/>
-        </w:rPr>
-        <w:t xml:space="preserve">Se </w:t>
-      </w:r>
-      <w:r>
-        <w:rPr>
-          <w:rFonts w:ascii="Calibri" w:hAnsi="Calibri" w:cs="Calibri"/>
-          <w:sz w:val="16"/>
-          <w:szCs w:val="16"/>
-        </w:rPr>
-        <w:t xml:space="preserve">creo un </w:t>
-      </w:r>
-      <w:proofErr w:type="spellStart"/>
-      <w:r>
-        <w:rPr>
-          <w:rFonts w:ascii="Calibri" w:hAnsi="Calibri" w:cs="Calibri"/>
-          <w:sz w:val="16"/>
-          <w:szCs w:val="16"/>
-        </w:rPr>
-        <w:t>loop</w:t>
-      </w:r>
-      <w:proofErr w:type="spellEnd"/>
-      <w:r>
-        <w:rPr>
-          <w:rFonts w:ascii="Calibri" w:hAnsi="Calibri" w:cs="Calibri"/>
-          <w:sz w:val="16"/>
-          <w:szCs w:val="16"/>
-        </w:rPr>
-        <w:t xml:space="preserve"> para validar el modelo con los parámetros de </w:t>
-      </w:r>
-      <w:proofErr w:type="gramStart"/>
-      <w:r>
-        <w:rPr>
-          <w:rFonts w:ascii="Calibri" w:hAnsi="Calibri" w:cs="Calibri"/>
-          <w:sz w:val="16"/>
-          <w:szCs w:val="16"/>
-        </w:rPr>
-        <w:t>error(</w:t>
-      </w:r>
-      <w:proofErr w:type="gramEnd"/>
-      <w:r>
-        <w:rPr>
-          <w:rFonts w:ascii="Calibri" w:hAnsi="Calibri" w:cs="Calibri"/>
-          <w:sz w:val="16"/>
-          <w:szCs w:val="16"/>
-        </w:rPr>
-        <w:t xml:space="preserve">aditivo, multiplicativo), tendencia(aditivo, multiplicativo, ninguno) y estacionalidad(aditivo, multiplicativo, ninguno. El resultado del mejor modelo fue: </w:t>
-      </w:r>
-    </w:p>
-    <w:tbl>
-      <w:tblPr>
-        <w:tblStyle w:val="TableGrid"/>
-        <w:tblW w:w="0" w:type="auto"/>
-        <w:jc w:val="center"/>
-        <w:tblLook w:val="04A0" w:firstRow="1" w:lastRow="0" w:firstColumn="1" w:lastColumn="0" w:noHBand="0" w:noVBand="1"/>
-      </w:tblPr>
-      <w:tblGrid>
-        <w:gridCol w:w="560"/>
-        <w:gridCol w:w="878"/>
-        <w:gridCol w:w="936"/>
-        <w:gridCol w:w="504"/>
-      </w:tblGrid>
-      <w:tr>
-        <w:trPr>
-          <w:jc w:val="center"/>
-        </w:trPr>
-        <w:tc>
-          <w:tcPr>
-            <w:tcW w:w="0" w:type="auto"/>
-            <w:hideMark/>
-          </w:tcPr>
-          <w:p>
-            <w:pPr>
-              <w:spacing w:after="160" w:line="278" w:lineRule="auto"/>
-              <w:jc w:val="both"/>
-              <w:rPr>
-                <w:rFonts w:ascii="Calibri" w:hAnsi="Calibri" w:cs="Calibri"/>
-                <w:b/>
-                <w:bCs/>
-                <w:sz w:val="12"/>
-                <w:szCs w:val="12"/>
-              </w:rPr>
-            </w:pPr>
-            <w:r>
-              <w:rPr>
-                <w:rFonts w:ascii="Calibri" w:hAnsi="Calibri" w:cs="Calibri"/>
-                <w:b/>
-                <w:bCs/>
-                <w:sz w:val="12"/>
-                <w:szCs w:val="12"/>
-              </w:rPr>
-              <w:t>Error</w:t>
-            </w:r>
-          </w:p>
-        </w:tc>
-        <w:tc>
-          <w:tcPr>
-            <w:tcW w:w="0" w:type="auto"/>
-            <w:hideMark/>
-          </w:tcPr>
-          <w:p>
-            <w:pPr>
-              <w:spacing w:after="160" w:line="278" w:lineRule="auto"/>
-              <w:jc w:val="both"/>
-              <w:rPr>
-                <w:rFonts w:ascii="Calibri" w:hAnsi="Calibri" w:cs="Calibri"/>
-                <w:b/>
-                <w:bCs/>
-                <w:sz w:val="12"/>
-                <w:szCs w:val="12"/>
-              </w:rPr>
-            </w:pPr>
-            <w:r>
-              <w:rPr>
-                <w:rFonts w:ascii="Calibri" w:hAnsi="Calibri" w:cs="Calibri"/>
-                <w:b/>
-                <w:bCs/>
-                <w:sz w:val="12"/>
-                <w:szCs w:val="12"/>
-              </w:rPr>
-              <w:t>Tendencia</w:t>
-            </w:r>
-          </w:p>
-        </w:tc>
-        <w:tc>
-          <w:tcPr>
-            <w:tcW w:w="0" w:type="auto"/>
-          </w:tcPr>
-          <w:p>
-            <w:pPr>
-              <w:spacing w:after="160" w:line="278" w:lineRule="auto"/>
-              <w:jc w:val="both"/>
-              <w:rPr>
-                <w:rFonts w:ascii="Calibri" w:hAnsi="Calibri" w:cs="Calibri"/>
-                <w:b/>
-                <w:bCs/>
-                <w:sz w:val="12"/>
-                <w:szCs w:val="12"/>
-              </w:rPr>
-            </w:pPr>
-            <w:r>
-              <w:rPr>
-                <w:rFonts w:ascii="Calibri" w:hAnsi="Calibri" w:cs="Calibri"/>
-                <w:b/>
-                <w:bCs/>
-                <w:sz w:val="12"/>
-                <w:szCs w:val="12"/>
-              </w:rPr>
-              <w:t>Estacionalidad</w:t>
-            </w:r>
-          </w:p>
-        </w:tc>
-        <w:tc>
-          <w:tcPr>
-            <w:tcW w:w="0" w:type="auto"/>
-            <w:hideMark/>
-          </w:tcPr>
-          <w:p>
-            <w:pPr>
-              <w:spacing w:after="160" w:line="278" w:lineRule="auto"/>
-              <w:jc w:val="both"/>
-              <w:rPr>
-                <w:rFonts w:ascii="Calibri" w:hAnsi="Calibri" w:cs="Calibri"/>
-                <w:b/>
-                <w:bCs/>
-                <w:sz w:val="12"/>
-                <w:szCs w:val="12"/>
-              </w:rPr>
-            </w:pPr>
-            <w:r>
-              <w:rPr>
-                <w:rFonts w:ascii="Calibri" w:hAnsi="Calibri" w:cs="Calibri"/>
-                <w:b/>
-                <w:bCs/>
-                <w:sz w:val="12"/>
-                <w:szCs w:val="12"/>
-              </w:rPr>
-              <w:t>RMSE</w:t>
-            </w:r>
-          </w:p>
-        </w:tc>
-      </w:tr>
-      <w:tr>
-        <w:trPr>
-          <w:jc w:val="center"/>
-        </w:trPr>
-        <w:tc>
-          <w:tcPr>
-            <w:tcW w:w="0" w:type="auto"/>
-            <w:hideMark/>
-          </w:tcPr>
-          <w:p>
-            <w:pPr>
-              <w:spacing w:after="160" w:line="278" w:lineRule="auto"/>
-              <w:jc w:val="both"/>
-              <w:rPr>
-                <w:rFonts w:ascii="Calibri" w:hAnsi="Calibri" w:cs="Calibri"/>
-                <w:sz w:val="12"/>
-                <w:szCs w:val="12"/>
-              </w:rPr>
-            </w:pPr>
-            <w:r>
-              <w:rPr>
-                <w:rFonts w:ascii="Calibri" w:hAnsi="Calibri" w:cs="Calibri"/>
-                <w:sz w:val="12"/>
-                <w:szCs w:val="12"/>
-              </w:rPr>
-              <w:t xml:space="preserve">Aditivo </w:t>
-            </w:r>
-          </w:p>
-        </w:tc>
-        <w:tc>
-          <w:tcPr>
-            <w:tcW w:w="0" w:type="auto"/>
-            <w:hideMark/>
-          </w:tcPr>
-          <w:p>
-            <w:pPr>
-              <w:spacing w:after="160" w:line="278" w:lineRule="auto"/>
-              <w:jc w:val="both"/>
-              <w:rPr>
-                <w:rFonts w:ascii="Calibri" w:hAnsi="Calibri" w:cs="Calibri"/>
-                <w:sz w:val="12"/>
-                <w:szCs w:val="12"/>
-              </w:rPr>
-            </w:pPr>
-            <w:r>
-              <w:rPr>
-                <w:rFonts w:ascii="Calibri" w:hAnsi="Calibri" w:cs="Calibri"/>
-                <w:sz w:val="12"/>
-                <w:szCs w:val="12"/>
-              </w:rPr>
-              <w:t>Multiplicativa</w:t>
-            </w:r>
-          </w:p>
-        </w:tc>
-        <w:tc>
-          <w:tcPr>
-            <w:tcW w:w="0" w:type="auto"/>
-            <w:hideMark/>
-          </w:tcPr>
-          <w:p>
-            <w:pPr>
-              <w:spacing w:after="160" w:line="278" w:lineRule="auto"/>
-              <w:jc w:val="both"/>
-              <w:rPr>
-                <w:rFonts w:ascii="Calibri" w:hAnsi="Calibri" w:cs="Calibri"/>
-                <w:sz w:val="12"/>
-                <w:szCs w:val="12"/>
-              </w:rPr>
-            </w:pPr>
-            <w:r>
-              <w:rPr>
-                <w:rFonts w:ascii="Calibri" w:hAnsi="Calibri" w:cs="Calibri"/>
-                <w:b/>
-                <w:bCs/>
-                <w:sz w:val="12"/>
-                <w:szCs w:val="12"/>
-              </w:rPr>
-              <w:t>Multiplicativa</w:t>
-            </w:r>
-          </w:p>
-        </w:tc>
-        <w:tc>
-          <w:tcPr>
-            <w:tcW w:w="0" w:type="auto"/>
-            <w:hideMark/>
-          </w:tcPr>
-          <w:p>
-            <w:pPr>
-              <w:spacing w:after="160" w:line="278" w:lineRule="auto"/>
-              <w:jc w:val="both"/>
-              <w:rPr>
-                <w:rFonts w:ascii="Calibri" w:hAnsi="Calibri" w:cs="Calibri"/>
-                <w:sz w:val="12"/>
-                <w:szCs w:val="12"/>
-              </w:rPr>
-            </w:pPr>
-            <w:r>
-              <w:rPr>
-                <w:rFonts w:ascii="Calibri" w:hAnsi="Calibri" w:cs="Calibri"/>
-                <w:b/>
-                <w:bCs/>
-                <w:sz w:val="12"/>
-                <w:szCs w:val="12"/>
-              </w:rPr>
-              <w:t>59.42</w:t>
-            </w:r>
-          </w:p>
-        </w:tc>
-      </w:tr>
-    </w:tbl>
-    <w:p>
-      <w:pPr>
-        <w:jc w:val="both"/>
-        <w:rPr>
-          <w:rFonts w:ascii="Calibri" w:eastAsiaTheme="minorEastAsia" w:hAnsi="Calibri" w:cs="Calibri"/>
-          <w:sz w:val="16"/>
-          <w:szCs w:val="16"/>
-        </w:rPr>
-      </w:pPr>
-      <w:r>
-        <w:rPr>
-          <w:rFonts w:ascii="Calibri" w:hAnsi="Calibri" w:cs="Calibri"/>
-          <w:sz w:val="16"/>
-          <w:szCs w:val="16"/>
-        </w:rPr>
-        <w:t xml:space="preserve">Los parámetros </w:t>
-      </w:r>
-      <m:oMath>
-        <m:r>
-          <w:rPr>
-            <w:rFonts w:ascii="Cambria Math" w:hAnsi="Cambria Math" w:cs="Calibri"/>
-            <w:sz w:val="16"/>
-            <w:szCs w:val="16"/>
-          </w:rPr>
-          <m:t>β</m:t>
-        </m:r>
-      </m:oMath>
-      <w:r>
-        <w:rPr>
-          <w:rFonts w:ascii="Calibri" w:eastAsiaTheme="minorEastAsia" w:hAnsi="Calibri" w:cs="Calibri"/>
-          <w:sz w:val="16"/>
-          <w:szCs w:val="16"/>
-        </w:rPr>
-        <w:t xml:space="preserve">, </w:t>
-      </w:r>
-      <m:oMath>
-        <m:r>
-          <w:rPr>
-            <w:rFonts w:ascii="Cambria Math" w:eastAsiaTheme="minorEastAsia" w:hAnsi="Cambria Math" w:cs="Calibri"/>
-            <w:sz w:val="16"/>
-            <w:szCs w:val="16"/>
-          </w:rPr>
-          <m:t>∝</m:t>
-        </m:r>
-      </m:oMath>
-      <w:r>
-        <w:rPr>
-          <w:rFonts w:ascii="Calibri" w:eastAsiaTheme="minorEastAsia" w:hAnsi="Calibri" w:cs="Calibri"/>
-          <w:sz w:val="16"/>
-          <w:szCs w:val="16"/>
-        </w:rPr>
-        <w:t xml:space="preserve">, y </w:t>
-      </w:r>
-      <m:oMath>
-        <m:r>
-          <w:rPr>
-            <w:rFonts w:ascii="Cambria Math" w:eastAsiaTheme="minorEastAsia" w:hAnsi="Cambria Math" w:cs="Calibri"/>
-            <w:sz w:val="16"/>
-            <w:szCs w:val="16"/>
-          </w:rPr>
-          <m:t>γ</m:t>
-        </m:r>
-      </m:oMath>
-      <w:r>
-        <w:rPr>
-          <w:rFonts w:ascii="Calibri" w:eastAsiaTheme="minorEastAsia" w:hAnsi="Calibri" w:cs="Calibri"/>
-          <w:sz w:val="16"/>
-          <w:szCs w:val="16"/>
-        </w:rPr>
-        <w:t xml:space="preserve"> del mejor modelo para entrenar son:</w:t>
-      </w:r>
-    </w:p>
-    <w:tbl>
-      <w:tblPr>
-        <w:tblStyle w:val="TableGrid"/>
-        <w:tblW w:w="0" w:type="auto"/>
-        <w:tblLook w:val="04A0" w:firstRow="1" w:lastRow="0" w:firstColumn="1" w:lastColumn="0" w:noHBand="0" w:noVBand="1"/>
-      </w:tblPr>
-      <w:tblGrid>
-        <w:gridCol w:w="1895"/>
-        <w:gridCol w:w="1773"/>
-        <w:gridCol w:w="1773"/>
-      </w:tblGrid>
-      <w:tr>
-        <w:tc>
-          <w:tcPr>
-            <w:tcW w:w="2942" w:type="dxa"/>
-          </w:tcPr>
-          <w:p>
-            <w:pPr>
-              <w:jc w:val="both"/>
-              <w:rPr>
-                <w:rFonts w:ascii="Calibri" w:hAnsi="Calibri" w:cs="Calibri"/>
-                <w:b/>
-                <w:bCs/>
-                <w:sz w:val="16"/>
-                <w:szCs w:val="16"/>
-              </w:rPr>
-            </w:pPr>
-            <m:oMathPara>
-              <m:oMath>
-                <m:r>
-                  <m:rPr>
-                    <m:sty m:val="bi"/>
-                  </m:rPr>
-                  <w:rPr>
-                    <w:rFonts w:ascii="Cambria Math" w:hAnsi="Cambria Math" w:cs="Calibri"/>
-                    <w:sz w:val="16"/>
-                    <w:szCs w:val="16"/>
-                  </w:rPr>
-                  <m:t>β</m:t>
-                </m:r>
-              </m:oMath>
-            </m:oMathPara>
-          </w:p>
-        </w:tc>
-        <w:tc>
-          <w:tcPr>
-            <w:tcW w:w="2943" w:type="dxa"/>
-          </w:tcPr>
-          <w:p>
-            <w:pPr>
-              <w:jc w:val="both"/>
-              <w:rPr>
-                <w:rFonts w:ascii="Calibri" w:hAnsi="Calibri" w:cs="Calibri"/>
-                <w:b/>
-                <w:bCs/>
-                <w:sz w:val="16"/>
-                <w:szCs w:val="16"/>
-              </w:rPr>
-            </w:pPr>
-            <m:oMathPara>
-              <m:oMath>
-                <m:r>
-                  <m:rPr>
-                    <m:sty m:val="bi"/>
-                  </m:rPr>
-                  <w:rPr>
-                    <w:rFonts w:ascii="Cambria Math" w:eastAsiaTheme="minorEastAsia" w:hAnsi="Cambria Math" w:cs="Calibri"/>
-                    <w:sz w:val="16"/>
-                    <w:szCs w:val="16"/>
-                  </w:rPr>
-                  <m:t>∝</m:t>
-                </m:r>
-              </m:oMath>
-            </m:oMathPara>
-          </w:p>
-        </w:tc>
-        <w:tc>
-          <w:tcPr>
-            <w:tcW w:w="2943" w:type="dxa"/>
-          </w:tcPr>
-          <w:p>
-            <w:pPr>
-              <w:jc w:val="both"/>
-              <w:rPr>
-                <w:rFonts w:ascii="Calibri" w:hAnsi="Calibri" w:cs="Calibri"/>
-                <w:b/>
-                <w:bCs/>
-                <w:sz w:val="16"/>
-                <w:szCs w:val="16"/>
-              </w:rPr>
-            </w:pPr>
-            <m:oMathPara>
-              <m:oMath>
-                <m:r>
-                  <m:rPr>
-                    <m:sty m:val="bi"/>
-                  </m:rPr>
-                  <w:rPr>
-                    <w:rFonts w:ascii="Cambria Math" w:eastAsiaTheme="minorEastAsia" w:hAnsi="Cambria Math" w:cs="Calibri"/>
-                    <w:sz w:val="16"/>
-                    <w:szCs w:val="16"/>
-                  </w:rPr>
-                  <m:t>γ</m:t>
-                </m:r>
-              </m:oMath>
-            </m:oMathPara>
-          </w:p>
-        </w:tc>
-      </w:tr>
-      <w:tr>
-        <w:tc>
-          <w:tcPr>
-            <w:tcW w:w="2942" w:type="dxa"/>
-          </w:tcPr>
-          <w:p>
-            <w:pPr>
-              <w:jc w:val="both"/>
-              <w:rPr>
-                <w:rFonts w:ascii="Calibri" w:hAnsi="Calibri" w:cs="Calibri"/>
-                <w:sz w:val="16"/>
-                <w:szCs w:val="16"/>
-              </w:rPr>
-            </w:pPr>
-            <w:r>
-              <w:rPr>
-                <w:rFonts w:ascii="Calibri" w:hAnsi="Calibri" w:cs="Calibri"/>
-                <w:sz w:val="16"/>
-                <w:szCs w:val="16"/>
-              </w:rPr>
-              <w:t>5.25341 × 10⁻¹</w:t>
-            </w:r>
-          </w:p>
-        </w:tc>
-        <w:tc>
-          <w:tcPr>
-            <w:tcW w:w="2943" w:type="dxa"/>
-          </w:tcPr>
-          <w:p>
-            <w:pPr>
-              <w:jc w:val="both"/>
-              <w:rPr>
-                <w:rFonts w:ascii="Calibri" w:hAnsi="Calibri" w:cs="Calibri"/>
-                <w:sz w:val="16"/>
-                <w:szCs w:val="16"/>
-              </w:rPr>
-            </w:pPr>
-            <w:r>
-              <w:rPr>
-                <w:rFonts w:ascii="Calibri" w:hAnsi="Calibri" w:cs="Calibri"/>
-                <w:sz w:val="16"/>
-                <w:szCs w:val="16"/>
-              </w:rPr>
-              <w:t>5.3 × 10⁻⁵</w:t>
-            </w:r>
-          </w:p>
-        </w:tc>
-        <w:tc>
-          <w:tcPr>
-            <w:tcW w:w="2943" w:type="dxa"/>
-          </w:tcPr>
-          <w:p>
-            <w:pPr>
-              <w:jc w:val="both"/>
-              <w:rPr>
-                <w:rFonts w:ascii="Calibri" w:hAnsi="Calibri" w:cs="Calibri"/>
-                <w:sz w:val="16"/>
-                <w:szCs w:val="16"/>
-              </w:rPr>
-            </w:pPr>
-            <w:r>
-              <w:rPr>
-                <w:rFonts w:ascii="Calibri" w:hAnsi="Calibri" w:cs="Calibri"/>
-                <w:sz w:val="16"/>
-                <w:szCs w:val="16"/>
-              </w:rPr>
-              <w:t>4.7 × 10⁻⁵</w:t>
-            </w:r>
-          </w:p>
-        </w:tc>
-      </w:tr>
-    </w:tbl>
-    <w:p>
-      <w:pPr>
-        <w:jc w:val="both"/>
-        <w:rPr>
-          <w:rFonts w:ascii="Calibri" w:hAnsi="Calibri" w:cs="Calibri"/>
-          <w:sz w:val="16"/>
-          <w:szCs w:val="16"/>
-        </w:rPr>
-      </w:pPr>
-    </w:p>
-    <w:p>
-      <w:pPr>
-        <w:jc w:val="both"/>
-        <w:rPr>
-          <w:rFonts w:ascii="Calibri" w:hAnsi="Calibri" w:cs="Calibri"/>
-          <w:sz w:val="16"/>
-          <w:szCs w:val="16"/>
-        </w:rPr>
-      </w:pPr>
-      <w:r>
-        <w:rPr>
-          <w:rFonts w:ascii="Calibri" w:hAnsi="Calibri" w:cs="Calibri"/>
-          <w:b/>
-          <w:bCs/>
-          <w:sz w:val="16"/>
-          <w:szCs w:val="16"/>
-        </w:rPr>
-        <w:t>Pronóstico para los próximos 6 meses (julio - diciembre 2019) de la serie Ocupados (miles):</w:t>
-      </w:r>
-      <w:r>
-        <w:rPr>
+      <w:r>
+        <w:rPr>
+          <w:rFonts w:ascii="Calibri" w:hAnsi="Calibri" w:cs="Calibri"/>
           <w:noProof/>
-        </w:rPr>
-        <w:t xml:space="preserve"> </w:t>
-      </w:r>
-      <w:r>
-        <w:rPr>
-          <w:rFonts w:ascii="Calibri" w:hAnsi="Calibri" w:cs="Calibri"/>
-          <w:sz w:val="16"/>
-          <w:szCs w:val="16"/>
-        </w:rPr>
-        <w:t xml:space="preserve">Los valores de los pronósticos se encuentran en la columna de Point </w:t>
-      </w:r>
-      <w:proofErr w:type="spellStart"/>
-      <w:r>
-        <w:rPr>
-          <w:rFonts w:ascii="Calibri" w:hAnsi="Calibri" w:cs="Calibri"/>
-          <w:sz w:val="16"/>
-          <w:szCs w:val="16"/>
-        </w:rPr>
-        <w:t>forecast</w:t>
-      </w:r>
-      <w:proofErr w:type="spellEnd"/>
-      <w:r>
-        <w:rPr>
-          <w:noProof/>
+          <w:sz w:val="16"/>
+          <w:szCs w:val="16"/>
         </w:rPr>
         <w:drawing>
-          <wp:inline distT="0" distB="0" distL="0" distR="0" wp14:anchorId="33666FB3" wp14:editId="7BD7E8EF">
-            <wp:extent cx="2447925" cy="1533525"/>
-            <wp:effectExtent l="0" t="0" r="9525" b="9525"/>
-            <wp:docPr id="1006189945" name="Picture 1" descr="A table with numbers and a few black text&#10;&#10;Description automatically generated"/>
+          <wp:inline distT="0" distB="0" distL="0" distR="0" wp14:anchorId="1AECF2C1" wp14:editId="5E07C349">
+            <wp:extent cx="3519577" cy="1768551"/>
+            <wp:effectExtent l="0" t="0" r="5080" b="3175"/>
+            <wp:docPr id="904405538" name="Imagen 1" descr="A graph showing a line&#10;&#10;Description automatically generated with medium confidence"/>
             <wp:cNvGraphicFramePr>
               <a:graphicFrameLocks xmlns:a="http://schemas.openxmlformats.org/drawingml/2006/main" noChangeAspect="1"/>
             </wp:cNvGraphicFramePr>
@@ -772,132 +130,7 @@
               <a:graphicData uri="http://schemas.openxmlformats.org/drawingml/2006/picture">
                 <pic:pic xmlns:pic="http://schemas.openxmlformats.org/drawingml/2006/picture">
                   <pic:nvPicPr>
-                    <pic:cNvPr id="1006189945" name="Picture 1" descr="A table with numbers and a few black text&#10;&#10;Description automatically generated"/>
-                    <pic:cNvPicPr/>
-                  </pic:nvPicPr>
-                  <pic:blipFill>
-                    <a:blip r:embed="rId7">
-                      <a:extLst>
-                        <a:ext uri="{28A0092B-C50C-407E-A947-70E740481C1C}">
-                          <a14:useLocalDpi xmlns:a14="http://schemas.microsoft.com/office/drawing/2010/main" val="0"/>
-                        </a:ext>
-                      </a:extLst>
-                    </a:blip>
-                    <a:stretch>
-                      <a:fillRect/>
-                    </a:stretch>
-                  </pic:blipFill>
-                  <pic:spPr>
-                    <a:xfrm>
-                      <a:off x="0" y="0"/>
-                      <a:ext cx="2447925" cy="1533525"/>
-                    </a:xfrm>
-                    <a:prstGeom prst="rect">
-                      <a:avLst/>
-                    </a:prstGeom>
-                  </pic:spPr>
-                </pic:pic>
-              </a:graphicData>
-            </a:graphic>
-          </wp:inline>
-        </w:drawing>
-      </w:r>
-    </w:p>
-    <w:p>
-      <w:pPr>
-        <w:jc w:val="center"/>
-        <w:rPr>
-          <w:rFonts w:ascii="Calibri" w:hAnsi="Calibri" w:cs="Calibri"/>
-          <w:sz w:val="16"/>
-          <w:szCs w:val="16"/>
-        </w:rPr>
-      </w:pPr>
-      <w:r>
-        <w:rPr>
-          <w:rFonts w:ascii="Calibri" w:hAnsi="Calibri" w:cs="Calibri"/>
-          <w:sz w:val="16"/>
-          <w:szCs w:val="16"/>
-        </w:rPr>
-        <w:t xml:space="preserve">Como se observa en la gráfica, el modelo captura la estabilidad reciente, </w:t>
-      </w:r>
-      <w:r>
-        <w:rPr>
-          <w:rFonts w:ascii="Calibri" w:hAnsi="Calibri" w:cs="Calibri"/>
-          <w:sz w:val="16"/>
-          <w:szCs w:val="16"/>
-        </w:rPr>
-        <w:t>sin</w:t>
-      </w:r>
-      <w:r>
-        <w:rPr>
-          <w:rFonts w:ascii="Calibri" w:hAnsi="Calibri" w:cs="Calibri"/>
-          <w:sz w:val="16"/>
-          <w:szCs w:val="16"/>
-        </w:rPr>
-        <w:t xml:space="preserve"> subestima</w:t>
-      </w:r>
-      <w:r>
-        <w:rPr>
-          <w:rFonts w:ascii="Calibri" w:hAnsi="Calibri" w:cs="Calibri"/>
-          <w:sz w:val="16"/>
-          <w:szCs w:val="16"/>
-        </w:rPr>
-        <w:t>r</w:t>
-      </w:r>
-      <w:r>
-        <w:rPr>
-          <w:rFonts w:ascii="Calibri" w:hAnsi="Calibri" w:cs="Calibri"/>
-          <w:sz w:val="16"/>
-          <w:szCs w:val="16"/>
-        </w:rPr>
-        <w:t xml:space="preserve"> la tendencia alcista del primer semestre de 2019, proyectando un nivel de ocupación </w:t>
-      </w:r>
-      <w:r>
-        <w:rPr>
-          <w:rFonts w:ascii="Calibri" w:hAnsi="Calibri" w:cs="Calibri"/>
-          <w:sz w:val="16"/>
-          <w:szCs w:val="16"/>
-        </w:rPr>
-        <w:t xml:space="preserve">con un pico de 11165 y luego una caída hasta 11069.  El modelo funciona bien desde que no haya un </w:t>
-      </w:r>
-      <w:proofErr w:type="spellStart"/>
-      <w:r>
-        <w:rPr>
-          <w:rFonts w:ascii="Calibri" w:hAnsi="Calibri" w:cs="Calibri"/>
-          <w:sz w:val="16"/>
-          <w:szCs w:val="16"/>
-        </w:rPr>
-        <w:t>patron</w:t>
-      </w:r>
-      <w:proofErr w:type="spellEnd"/>
-      <w:r>
-        <w:rPr>
-          <w:rFonts w:ascii="Calibri" w:hAnsi="Calibri" w:cs="Calibri"/>
-          <w:sz w:val="16"/>
-          <w:szCs w:val="16"/>
-        </w:rPr>
-        <w:t xml:space="preserve"> muy por fuera de la serie ya que tiene su intervalo de confianza en un rango limitado</w:t>
-      </w:r>
-      <w:r>
-        <w:rPr>
-          <w:rFonts w:ascii="Calibri" w:hAnsi="Calibri" w:cs="Calibri"/>
-          <w:noProof/>
-          <w:sz w:val="16"/>
-          <w:szCs w:val="16"/>
-        </w:rPr>
-        <w:drawing>
-          <wp:inline distT="0" distB="0" distL="0" distR="0" wp14:anchorId="3173C4CD" wp14:editId="6CD32C7D">
-            <wp:extent cx="2355850" cy="1406525"/>
-            <wp:effectExtent l="0" t="0" r="6350" b="3175"/>
-            <wp:docPr id="1291762279" name="Imagen 1" descr="A graph with a line and numbers&#10;&#10;Description automatically generated"/>
-            <wp:cNvGraphicFramePr>
-              <a:graphicFrameLocks xmlns:a="http://schemas.openxmlformats.org/drawingml/2006/main" noChangeAspect="1"/>
-            </wp:cNvGraphicFramePr>
-            <a:graphic xmlns:a="http://schemas.openxmlformats.org/drawingml/2006/main">
-              <a:graphicData uri="http://schemas.openxmlformats.org/drawingml/2006/picture">
-                <pic:pic xmlns:pic="http://schemas.openxmlformats.org/drawingml/2006/picture">
-                  <pic:nvPicPr>
-                    <pic:cNvPr id="1291762279" name="Imagen 1" descr="A graph with a line and numbers&#10;&#10;Description automatically generated"/>
+                    <pic:cNvPr id="904405538" name="Imagen 1" descr="A graph showing a line&#10;&#10;Description automatically generated with medium confidence"/>
                     <pic:cNvPicPr/>
                   </pic:nvPicPr>
                   <pic:blipFill>
@@ -915,7 +148,7 @@
                   <pic:spPr>
                     <a:xfrm>
                       <a:off x="0" y="0"/>
-                      <a:ext cx="2355850" cy="1406525"/>
+                      <a:ext cx="3535840" cy="1776723"/>
                     </a:xfrm>
                     <a:prstGeom prst="rect">
                       <a:avLst/>
@@ -930,12 +163,8 @@
     </w:p>
     <w:p>
       <w:pPr>
+        <w:spacing w:after="0" w:line="240" w:lineRule="auto"/>
         <w:jc w:val="both"/>
-        <w:rPr>
-          <w:rFonts w:ascii="Calibri" w:hAnsi="Calibri" w:cs="Calibri"/>
-          <w:sz w:val="16"/>
-          <w:szCs w:val="16"/>
-        </w:rPr>
       </w:pPr>
       <w:r>
         <w:rPr>
@@ -945,7 +174,7 @@
           <w:sz w:val="16"/>
           <w:szCs w:val="16"/>
         </w:rPr>
-        <w:t xml:space="preserve">Limitaciones: </w:t>
+        <w:t xml:space="preserve">Evaluación </w:t>
       </w:r>
       <w:r>
         <w:rPr>
@@ -955,15 +184,1468 @@
           <w:sz w:val="16"/>
           <w:szCs w:val="16"/>
         </w:rPr>
+        <w:t xml:space="preserve">del modelo con tendencia </w:t>
+      </w:r>
+      <w:proofErr w:type="spellStart"/>
+      <w:r>
+        <w:rPr>
+          <w:rFonts w:ascii="Calibri" w:hAnsi="Calibri" w:cs="Calibri"/>
+          <w:b/>
+          <w:bCs/>
+          <w:sz w:val="16"/>
+          <w:szCs w:val="16"/>
+        </w:rPr>
+        <w:t>cubica+estacionalidad</w:t>
+      </w:r>
+      <w:proofErr w:type="spellEnd"/>
+      <w:r>
+        <w:rPr>
+          <w:rFonts w:ascii="Calibri" w:hAnsi="Calibri" w:cs="Calibri"/>
+          <w:b/>
+          <w:bCs/>
+          <w:sz w:val="16"/>
+          <w:szCs w:val="16"/>
+        </w:rPr>
         <w:t xml:space="preserve"> </w:t>
       </w:r>
       <w:r>
         <w:rPr>
           <w:rFonts w:ascii="Calibri" w:hAnsi="Calibri" w:cs="Calibri"/>
-          <w:sz w:val="16"/>
-          <w:szCs w:val="16"/>
-        </w:rPr>
-        <w:t xml:space="preserve">Los modelos de </w:t>
+          <w:b/>
+          <w:bCs/>
+          <w:sz w:val="16"/>
+          <w:szCs w:val="16"/>
+        </w:rPr>
+        <w:t xml:space="preserve"> </w:t>
+      </w:r>
+    </w:p>
+    <w:p>
+      <w:pPr>
+        <w:spacing w:line="240" w:lineRule="auto"/>
+        <w:jc w:val="both"/>
+        <w:rPr>
+          <w:rFonts w:ascii="Calibri" w:hAnsi="Calibri" w:cs="Calibri"/>
+          <w:sz w:val="16"/>
+          <w:szCs w:val="16"/>
+        </w:rPr>
+      </w:pPr>
+      <w:r>
+        <w:rPr>
+          <w:rFonts w:ascii="Calibri" w:hAnsi="Calibri" w:cs="Calibri"/>
+          <w:sz w:val="16"/>
+          <w:szCs w:val="16"/>
+        </w:rPr>
+        <w:t xml:space="preserve">Se </w:t>
+      </w:r>
+      <w:r>
+        <w:rPr>
+          <w:rFonts w:ascii="Calibri" w:hAnsi="Calibri" w:cs="Calibri"/>
+          <w:sz w:val="16"/>
+          <w:szCs w:val="16"/>
+        </w:rPr>
+        <w:t>evaluaron diferentes modelos con tendencia lineal, cuadrática</w:t>
+      </w:r>
+      <w:r>
+        <w:rPr>
+          <w:rFonts w:ascii="Calibri" w:hAnsi="Calibri" w:cs="Calibri"/>
+          <w:sz w:val="16"/>
+          <w:szCs w:val="16"/>
+        </w:rPr>
+        <w:t xml:space="preserve"> y</w:t>
+      </w:r>
+      <w:r>
+        <w:rPr>
+          <w:rFonts w:ascii="Calibri" w:hAnsi="Calibri" w:cs="Calibri"/>
+          <w:sz w:val="16"/>
+          <w:szCs w:val="16"/>
+        </w:rPr>
+        <w:t xml:space="preserve"> cubica. Dentro de los modelos, el modelo con tendencia cubica</w:t>
+      </w:r>
+      <w:r>
+        <w:rPr>
+          <w:rFonts w:ascii="Calibri" w:hAnsi="Calibri" w:cs="Calibri"/>
+          <w:sz w:val="16"/>
+          <w:szCs w:val="16"/>
+        </w:rPr>
+        <w:t xml:space="preserve"> </w:t>
+      </w:r>
+      <w:r>
+        <w:rPr>
+          <w:rFonts w:ascii="Calibri" w:hAnsi="Calibri" w:cs="Calibri"/>
+          <w:sz w:val="16"/>
+          <w:szCs w:val="16"/>
+        </w:rPr>
+        <w:t>+</w:t>
+      </w:r>
+      <w:r>
+        <w:rPr>
+          <w:rFonts w:ascii="Calibri" w:hAnsi="Calibri" w:cs="Calibri"/>
+          <w:sz w:val="16"/>
+          <w:szCs w:val="16"/>
+        </w:rPr>
+        <w:t xml:space="preserve"> </w:t>
+      </w:r>
+      <w:r>
+        <w:rPr>
+          <w:rFonts w:ascii="Calibri" w:hAnsi="Calibri" w:cs="Calibri"/>
+          <w:sz w:val="16"/>
+          <w:szCs w:val="16"/>
+        </w:rPr>
+        <w:t>el componente estacional logra capturar adecuadamente el crecimiento y las fluctuaciones periódicas de la serie</w:t>
+      </w:r>
+      <w:r>
+        <w:rPr>
+          <w:rFonts w:ascii="Calibri" w:hAnsi="Calibri" w:cs="Calibri"/>
+          <w:sz w:val="16"/>
+          <w:szCs w:val="16"/>
+        </w:rPr>
+        <w:t xml:space="preserve">: </w:t>
+      </w:r>
+      <w:r>
+        <w:rPr>
+          <w:rFonts w:ascii="Calibri" w:hAnsi="Calibri" w:cs="Calibri"/>
+          <w:sz w:val="16"/>
+          <w:szCs w:val="16"/>
+        </w:rPr>
+        <w:drawing>
+          <wp:inline distT="0" distB="0" distL="0" distR="0" wp14:anchorId="739E666B" wp14:editId="6CCF01F2">
+            <wp:extent cx="2814452" cy="2043072"/>
+            <wp:effectExtent l="0" t="0" r="5080" b="0"/>
+            <wp:docPr id="2012746839" name="Picture 1"/>
+            <wp:cNvGraphicFramePr>
+              <a:graphicFrameLocks xmlns:a="http://schemas.openxmlformats.org/drawingml/2006/main" noChangeAspect="1"/>
+            </wp:cNvGraphicFramePr>
+            <a:graphic xmlns:a="http://schemas.openxmlformats.org/drawingml/2006/main">
+              <a:graphicData uri="http://schemas.openxmlformats.org/drawingml/2006/picture">
+                <pic:pic xmlns:pic="http://schemas.openxmlformats.org/drawingml/2006/picture">
+                  <pic:nvPicPr>
+                    <pic:cNvPr id="2012746839" name=""/>
+                    <pic:cNvPicPr/>
+                  </pic:nvPicPr>
+                  <pic:blipFill>
+                    <a:blip r:embed="rId9"/>
+                    <a:stretch>
+                      <a:fillRect/>
+                    </a:stretch>
+                  </pic:blipFill>
+                  <pic:spPr>
+                    <a:xfrm>
+                      <a:off x="0" y="0"/>
+                      <a:ext cx="2823608" cy="2049719"/>
+                    </a:xfrm>
+                    <a:prstGeom prst="rect">
+                      <a:avLst/>
+                    </a:prstGeom>
+                  </pic:spPr>
+                </pic:pic>
+              </a:graphicData>
+            </a:graphic>
+          </wp:inline>
+        </w:drawing>
+      </w:r>
+    </w:p>
+    <w:p>
+      <w:pPr>
+        <w:spacing w:line="240" w:lineRule="auto"/>
+        <w:jc w:val="both"/>
+        <w:rPr>
+          <w:rFonts w:ascii="Calibri" w:eastAsiaTheme="minorEastAsia" w:hAnsi="Calibri" w:cs="Calibri"/>
+          <w:sz w:val="16"/>
+          <w:szCs w:val="16"/>
+        </w:rPr>
+      </w:pPr>
+      <w:r>
+        <w:rPr>
+          <w:rFonts w:ascii="Calibri" w:hAnsi="Calibri" w:cs="Calibri"/>
+          <w:sz w:val="16"/>
+          <w:szCs w:val="16"/>
+        </w:rPr>
+        <w:t>La evaluación de los modelos se realiza con métricas en este caso usamos el RMSE que nos da la diferencia promedio entre los estimados de un modelo, cuanto menor sea su valor, se ajusta mejor.  En la Tabla que se muestra a continuación de pueden observar los modelos que han sido construidos con su respectivo RMSE</w:t>
+      </w:r>
+      <w:r>
+        <w:rPr>
+          <w:rFonts w:ascii="Calibri" w:hAnsi="Calibri" w:cs="Calibri"/>
+          <w:sz w:val="16"/>
+          <w:szCs w:val="16"/>
+        </w:rPr>
+        <w:t>.</w:t>
+      </w:r>
+    </w:p>
+    <w:tbl>
+      <w:tblPr>
+        <w:tblW w:w="4390" w:type="dxa"/>
+        <w:tblCellMar>
+          <w:left w:w="70" w:type="dxa"/>
+          <w:right w:w="70" w:type="dxa"/>
+        </w:tblCellMar>
+        <w:tblLook w:val="04A0" w:firstRow="1" w:lastRow="0" w:firstColumn="1" w:lastColumn="0" w:noHBand="0" w:noVBand="1"/>
+      </w:tblPr>
+      <w:tblGrid>
+        <w:gridCol w:w="1760"/>
+        <w:gridCol w:w="960"/>
+        <w:gridCol w:w="1670"/>
+      </w:tblGrid>
+      <w:tr>
+        <w:trPr>
+          <w:trHeight w:val="300"/>
+        </w:trPr>
+        <w:tc>
+          <w:tcPr>
+            <w:tcW w:w="1760" w:type="dxa"/>
+            <w:tcBorders>
+              <w:top w:val="single" w:sz="4" w:space="0" w:color="auto"/>
+              <w:left w:val="single" w:sz="4" w:space="0" w:color="auto"/>
+              <w:bottom w:val="single" w:sz="4" w:space="0" w:color="auto"/>
+              <w:right w:val="single" w:sz="4" w:space="0" w:color="auto"/>
+            </w:tcBorders>
+            <w:shd w:val="clear" w:color="auto" w:fill="auto"/>
+            <w:noWrap/>
+            <w:vAlign w:val="bottom"/>
+            <w:hideMark/>
+          </w:tcPr>
+          <w:p>
+            <w:pPr>
+              <w:spacing w:after="0" w:line="240" w:lineRule="auto"/>
+              <w:jc w:val="both"/>
+              <w:rPr>
+                <w:rFonts w:ascii="Calibri" w:eastAsia="Times New Roman" w:hAnsi="Calibri" w:cs="Calibri"/>
+                <w:b/>
+                <w:bCs/>
+                <w:color w:val="000000"/>
+                <w:kern w:val="0"/>
+                <w:sz w:val="22"/>
+                <w:szCs w:val="22"/>
+                <w:lang w:eastAsia="es-CO"/>
+                <w14:ligatures w14:val="none"/>
+              </w:rPr>
+            </w:pPr>
+            <w:r>
+              <w:rPr>
+                <w:rFonts w:ascii="Calibri" w:eastAsia="Times New Roman" w:hAnsi="Calibri" w:cs="Calibri"/>
+                <w:b/>
+                <w:bCs/>
+                <w:color w:val="000000"/>
+                <w:kern w:val="0"/>
+                <w:sz w:val="22"/>
+                <w:szCs w:val="22"/>
+                <w:lang w:eastAsia="es-CO"/>
+                <w14:ligatures w14:val="none"/>
+              </w:rPr>
+              <w:t>Modelo</w:t>
+            </w:r>
+          </w:p>
+        </w:tc>
+        <w:tc>
+          <w:tcPr>
+            <w:tcW w:w="960" w:type="dxa"/>
+            <w:tcBorders>
+              <w:top w:val="single" w:sz="4" w:space="0" w:color="auto"/>
+              <w:left w:val="nil"/>
+              <w:bottom w:val="single" w:sz="4" w:space="0" w:color="auto"/>
+              <w:right w:val="single" w:sz="4" w:space="0" w:color="auto"/>
+            </w:tcBorders>
+            <w:shd w:val="clear" w:color="auto" w:fill="auto"/>
+            <w:noWrap/>
+            <w:vAlign w:val="bottom"/>
+            <w:hideMark/>
+          </w:tcPr>
+          <w:p>
+            <w:pPr>
+              <w:spacing w:after="0" w:line="240" w:lineRule="auto"/>
+              <w:jc w:val="both"/>
+              <w:rPr>
+                <w:rFonts w:ascii="Calibri" w:eastAsia="Times New Roman" w:hAnsi="Calibri" w:cs="Calibri"/>
+                <w:b/>
+                <w:bCs/>
+                <w:color w:val="000000"/>
+                <w:kern w:val="0"/>
+                <w:sz w:val="22"/>
+                <w:szCs w:val="22"/>
+                <w:lang w:eastAsia="es-CO"/>
+                <w14:ligatures w14:val="none"/>
+              </w:rPr>
+            </w:pPr>
+            <w:r>
+              <w:rPr>
+                <w:rFonts w:ascii="Calibri" w:eastAsia="Times New Roman" w:hAnsi="Calibri" w:cs="Calibri"/>
+                <w:b/>
+                <w:bCs/>
+                <w:color w:val="000000"/>
+                <w:kern w:val="0"/>
+                <w:sz w:val="22"/>
+                <w:szCs w:val="22"/>
+                <w:lang w:eastAsia="es-CO"/>
+                <w14:ligatures w14:val="none"/>
+              </w:rPr>
+              <w:t>RMSE</w:t>
+            </w:r>
+          </w:p>
+        </w:tc>
+        <w:tc>
+          <w:tcPr>
+            <w:tcW w:w="1670" w:type="dxa"/>
+            <w:tcBorders>
+              <w:top w:val="single" w:sz="4" w:space="0" w:color="auto"/>
+              <w:left w:val="nil"/>
+              <w:bottom w:val="single" w:sz="4" w:space="0" w:color="auto"/>
+              <w:right w:val="single" w:sz="4" w:space="0" w:color="auto"/>
+            </w:tcBorders>
+            <w:shd w:val="clear" w:color="auto" w:fill="auto"/>
+            <w:noWrap/>
+            <w:vAlign w:val="bottom"/>
+            <w:hideMark/>
+          </w:tcPr>
+          <w:p>
+            <w:pPr>
+              <w:spacing w:after="0" w:line="240" w:lineRule="auto"/>
+              <w:jc w:val="both"/>
+              <w:rPr>
+                <w:rFonts w:ascii="Calibri" w:eastAsia="Times New Roman" w:hAnsi="Calibri" w:cs="Calibri"/>
+                <w:color w:val="000000"/>
+                <w:kern w:val="0"/>
+                <w:sz w:val="22"/>
+                <w:szCs w:val="22"/>
+                <w:lang w:eastAsia="es-CO"/>
+                <w14:ligatures w14:val="none"/>
+              </w:rPr>
+            </w:pPr>
+            <w:r>
+              <w:rPr>
+                <w:rFonts w:ascii="Calibri" w:eastAsia="Times New Roman" w:hAnsi="Calibri" w:cs="Calibri"/>
+                <w:color w:val="000000"/>
+                <w:kern w:val="0"/>
+                <w:sz w:val="22"/>
+                <w:szCs w:val="22"/>
+                <w:lang w:eastAsia="es-CO"/>
+                <w14:ligatures w14:val="none"/>
+              </w:rPr>
+              <w:t> </w:t>
+            </w:r>
+          </w:p>
+        </w:tc>
+      </w:tr>
+      <w:tr>
+        <w:trPr>
+          <w:trHeight w:val="300"/>
+        </w:trPr>
+        <w:tc>
+          <w:tcPr>
+            <w:tcW w:w="1760" w:type="dxa"/>
+            <w:tcBorders>
+              <w:top w:val="nil"/>
+              <w:left w:val="single" w:sz="4" w:space="0" w:color="auto"/>
+              <w:bottom w:val="single" w:sz="4" w:space="0" w:color="auto"/>
+              <w:right w:val="single" w:sz="4" w:space="0" w:color="auto"/>
+            </w:tcBorders>
+            <w:shd w:val="clear" w:color="auto" w:fill="auto"/>
+            <w:noWrap/>
+            <w:vAlign w:val="bottom"/>
+            <w:hideMark/>
+          </w:tcPr>
+          <w:p>
+            <w:pPr>
+              <w:spacing w:after="0" w:line="240" w:lineRule="auto"/>
+              <w:jc w:val="both"/>
+              <w:rPr>
+                <w:rFonts w:ascii="Calibri" w:eastAsia="Times New Roman" w:hAnsi="Calibri" w:cs="Calibri"/>
+                <w:color w:val="000000"/>
+                <w:kern w:val="0"/>
+                <w:sz w:val="22"/>
+                <w:szCs w:val="22"/>
+                <w:lang w:eastAsia="es-CO"/>
+                <w14:ligatures w14:val="none"/>
+              </w:rPr>
+            </w:pPr>
+            <w:r>
+              <w:rPr>
+                <w:rFonts w:ascii="Calibri" w:eastAsia="Times New Roman" w:hAnsi="Calibri" w:cs="Calibri"/>
+                <w:color w:val="000000"/>
+                <w:kern w:val="0"/>
+                <w:sz w:val="22"/>
+                <w:szCs w:val="22"/>
+                <w:lang w:eastAsia="es-CO"/>
+                <w14:ligatures w14:val="none"/>
+              </w:rPr>
+              <w:t xml:space="preserve">Media </w:t>
+            </w:r>
+            <w:proofErr w:type="spellStart"/>
+            <w:r>
+              <w:rPr>
+                <w:rFonts w:ascii="Calibri" w:eastAsia="Times New Roman" w:hAnsi="Calibri" w:cs="Calibri"/>
+                <w:color w:val="000000"/>
+                <w:kern w:val="0"/>
+                <w:sz w:val="22"/>
+                <w:szCs w:val="22"/>
+                <w:lang w:eastAsia="es-CO"/>
+                <w14:ligatures w14:val="none"/>
+              </w:rPr>
+              <w:t>movil</w:t>
+            </w:r>
+            <w:proofErr w:type="spellEnd"/>
+          </w:p>
+        </w:tc>
+        <w:tc>
+          <w:tcPr>
+            <w:tcW w:w="960" w:type="dxa"/>
+            <w:tcBorders>
+              <w:top w:val="nil"/>
+              <w:left w:val="nil"/>
+              <w:bottom w:val="single" w:sz="4" w:space="0" w:color="auto"/>
+              <w:right w:val="single" w:sz="4" w:space="0" w:color="auto"/>
+            </w:tcBorders>
+            <w:shd w:val="clear" w:color="auto" w:fill="auto"/>
+            <w:noWrap/>
+            <w:vAlign w:val="bottom"/>
+            <w:hideMark/>
+          </w:tcPr>
+          <w:p>
+            <w:pPr>
+              <w:spacing w:after="0" w:line="240" w:lineRule="auto"/>
+              <w:jc w:val="both"/>
+              <w:rPr>
+                <w:rFonts w:ascii="Calibri" w:eastAsia="Times New Roman" w:hAnsi="Calibri" w:cs="Calibri"/>
+                <w:color w:val="000000"/>
+                <w:kern w:val="0"/>
+                <w:sz w:val="22"/>
+                <w:szCs w:val="22"/>
+                <w:lang w:eastAsia="es-CO"/>
+                <w14:ligatures w14:val="none"/>
+              </w:rPr>
+            </w:pPr>
+            <w:r>
+              <w:rPr>
+                <w:rFonts w:ascii="Calibri" w:eastAsia="Times New Roman" w:hAnsi="Calibri" w:cs="Calibri"/>
+                <w:color w:val="000000"/>
+                <w:kern w:val="0"/>
+                <w:sz w:val="22"/>
+                <w:szCs w:val="22"/>
+                <w:lang w:eastAsia="es-CO"/>
+                <w14:ligatures w14:val="none"/>
+              </w:rPr>
+              <w:t>242.83</w:t>
+            </w:r>
+          </w:p>
+        </w:tc>
+        <w:tc>
+          <w:tcPr>
+            <w:tcW w:w="1670" w:type="dxa"/>
+            <w:tcBorders>
+              <w:top w:val="nil"/>
+              <w:left w:val="nil"/>
+              <w:bottom w:val="single" w:sz="4" w:space="0" w:color="auto"/>
+              <w:right w:val="single" w:sz="4" w:space="0" w:color="auto"/>
+            </w:tcBorders>
+            <w:shd w:val="clear" w:color="auto" w:fill="auto"/>
+            <w:noWrap/>
+            <w:vAlign w:val="bottom"/>
+            <w:hideMark/>
+          </w:tcPr>
+          <w:p>
+            <w:pPr>
+              <w:spacing w:after="0" w:line="240" w:lineRule="auto"/>
+              <w:jc w:val="both"/>
+              <w:rPr>
+                <w:rFonts w:ascii="Calibri" w:eastAsia="Times New Roman" w:hAnsi="Calibri" w:cs="Calibri"/>
+                <w:color w:val="000000"/>
+                <w:kern w:val="0"/>
+                <w:sz w:val="22"/>
+                <w:szCs w:val="22"/>
+                <w:lang w:eastAsia="es-CO"/>
+                <w14:ligatures w14:val="none"/>
+              </w:rPr>
+            </w:pPr>
+            <w:r>
+              <w:rPr>
+                <w:rFonts w:ascii="Calibri" w:eastAsia="Times New Roman" w:hAnsi="Calibri" w:cs="Calibri"/>
+                <w:color w:val="000000"/>
+                <w:kern w:val="0"/>
+                <w:sz w:val="22"/>
+                <w:szCs w:val="22"/>
+                <w:lang w:eastAsia="es-CO"/>
+                <w14:ligatures w14:val="none"/>
+              </w:rPr>
+              <w:t> </w:t>
+            </w:r>
+          </w:p>
+        </w:tc>
+      </w:tr>
+      <w:tr>
+        <w:trPr>
+          <w:trHeight w:val="300"/>
+        </w:trPr>
+        <w:tc>
+          <w:tcPr>
+            <w:tcW w:w="1760" w:type="dxa"/>
+            <w:tcBorders>
+              <w:top w:val="nil"/>
+              <w:left w:val="single" w:sz="4" w:space="0" w:color="auto"/>
+              <w:bottom w:val="single" w:sz="4" w:space="0" w:color="auto"/>
+              <w:right w:val="single" w:sz="4" w:space="0" w:color="auto"/>
+            </w:tcBorders>
+            <w:shd w:val="clear" w:color="auto" w:fill="auto"/>
+            <w:noWrap/>
+            <w:vAlign w:val="bottom"/>
+            <w:hideMark/>
+          </w:tcPr>
+          <w:p>
+            <w:pPr>
+              <w:spacing w:after="0" w:line="240" w:lineRule="auto"/>
+              <w:jc w:val="both"/>
+              <w:rPr>
+                <w:rFonts w:ascii="Calibri" w:eastAsia="Times New Roman" w:hAnsi="Calibri" w:cs="Calibri"/>
+                <w:b/>
+                <w:bCs/>
+                <w:color w:val="000000"/>
+                <w:kern w:val="0"/>
+                <w:sz w:val="22"/>
+                <w:szCs w:val="22"/>
+                <w:lang w:eastAsia="es-CO"/>
+                <w14:ligatures w14:val="none"/>
+              </w:rPr>
+            </w:pPr>
+            <w:r>
+              <w:rPr>
+                <w:rFonts w:ascii="Calibri" w:eastAsia="Times New Roman" w:hAnsi="Calibri" w:cs="Calibri"/>
+                <w:b/>
+                <w:bCs/>
+                <w:color w:val="000000"/>
+                <w:kern w:val="0"/>
+                <w:sz w:val="22"/>
+                <w:szCs w:val="22"/>
+                <w:lang w:eastAsia="es-CO"/>
+                <w14:ligatures w14:val="none"/>
+              </w:rPr>
+              <w:t>Hot-</w:t>
+            </w:r>
+            <w:proofErr w:type="spellStart"/>
+            <w:r>
+              <w:rPr>
+                <w:rFonts w:ascii="Calibri" w:eastAsia="Times New Roman" w:hAnsi="Calibri" w:cs="Calibri"/>
+                <w:b/>
+                <w:bCs/>
+                <w:color w:val="000000"/>
+                <w:kern w:val="0"/>
+                <w:sz w:val="22"/>
+                <w:szCs w:val="22"/>
+                <w:lang w:eastAsia="es-CO"/>
+                <w14:ligatures w14:val="none"/>
+              </w:rPr>
+              <w:t>winters</w:t>
+            </w:r>
+            <w:proofErr w:type="spellEnd"/>
+            <w:r>
+              <w:rPr>
+                <w:rFonts w:ascii="Calibri" w:eastAsia="Times New Roman" w:hAnsi="Calibri" w:cs="Calibri"/>
+                <w:b/>
+                <w:bCs/>
+                <w:color w:val="000000"/>
+                <w:kern w:val="0"/>
+                <w:sz w:val="22"/>
+                <w:szCs w:val="22"/>
+                <w:lang w:eastAsia="es-CO"/>
+                <w14:ligatures w14:val="none"/>
+              </w:rPr>
+              <w:t>(M-M)</w:t>
+            </w:r>
+          </w:p>
+        </w:tc>
+        <w:tc>
+          <w:tcPr>
+            <w:tcW w:w="960" w:type="dxa"/>
+            <w:tcBorders>
+              <w:top w:val="nil"/>
+              <w:left w:val="nil"/>
+              <w:bottom w:val="single" w:sz="4" w:space="0" w:color="auto"/>
+              <w:right w:val="single" w:sz="4" w:space="0" w:color="auto"/>
+            </w:tcBorders>
+            <w:shd w:val="clear" w:color="auto" w:fill="auto"/>
+            <w:noWrap/>
+            <w:vAlign w:val="bottom"/>
+            <w:hideMark/>
+          </w:tcPr>
+          <w:p>
+            <w:pPr>
+              <w:spacing w:after="0" w:line="240" w:lineRule="auto"/>
+              <w:jc w:val="both"/>
+              <w:rPr>
+                <w:rFonts w:ascii="Calibri" w:eastAsia="Times New Roman" w:hAnsi="Calibri" w:cs="Calibri"/>
+                <w:b/>
+                <w:bCs/>
+                <w:color w:val="000000"/>
+                <w:kern w:val="0"/>
+                <w:sz w:val="22"/>
+                <w:szCs w:val="22"/>
+                <w:lang w:eastAsia="es-CO"/>
+                <w14:ligatures w14:val="none"/>
+              </w:rPr>
+            </w:pPr>
+            <w:r>
+              <w:rPr>
+                <w:rFonts w:ascii="Calibri" w:eastAsia="Times New Roman" w:hAnsi="Calibri" w:cs="Calibri"/>
+                <w:b/>
+                <w:bCs/>
+                <w:color w:val="000000"/>
+                <w:kern w:val="0"/>
+                <w:sz w:val="22"/>
+                <w:szCs w:val="22"/>
+                <w:lang w:eastAsia="es-CO"/>
+                <w14:ligatures w14:val="none"/>
+              </w:rPr>
+              <w:t>59.42</w:t>
+            </w:r>
+          </w:p>
+        </w:tc>
+        <w:tc>
+          <w:tcPr>
+            <w:tcW w:w="1670" w:type="dxa"/>
+            <w:tcBorders>
+              <w:top w:val="nil"/>
+              <w:left w:val="nil"/>
+              <w:bottom w:val="single" w:sz="4" w:space="0" w:color="auto"/>
+              <w:right w:val="single" w:sz="4" w:space="0" w:color="auto"/>
+            </w:tcBorders>
+            <w:shd w:val="clear" w:color="auto" w:fill="auto"/>
+            <w:noWrap/>
+            <w:vAlign w:val="bottom"/>
+            <w:hideMark/>
+          </w:tcPr>
+          <w:p>
+            <w:pPr>
+              <w:spacing w:after="0" w:line="240" w:lineRule="auto"/>
+              <w:jc w:val="both"/>
+              <w:rPr>
+                <w:rFonts w:ascii="Calibri" w:eastAsia="Times New Roman" w:hAnsi="Calibri" w:cs="Calibri"/>
+                <w:b/>
+                <w:bCs/>
+                <w:color w:val="000000"/>
+                <w:kern w:val="0"/>
+                <w:sz w:val="22"/>
+                <w:szCs w:val="22"/>
+                <w:lang w:eastAsia="es-CO"/>
+                <w14:ligatures w14:val="none"/>
+              </w:rPr>
+            </w:pPr>
+            <w:r>
+              <w:rPr>
+                <w:rFonts w:ascii="Calibri" w:eastAsia="Times New Roman" w:hAnsi="Calibri" w:cs="Calibri"/>
+                <w:b/>
+                <w:bCs/>
+                <w:color w:val="000000"/>
+                <w:kern w:val="0"/>
+                <w:sz w:val="22"/>
+                <w:szCs w:val="22"/>
+                <w:lang w:eastAsia="es-CO"/>
+                <w14:ligatures w14:val="none"/>
+              </w:rPr>
+              <w:t>Mejor modelo</w:t>
+            </w:r>
+          </w:p>
+        </w:tc>
+      </w:tr>
+      <w:tr>
+        <w:trPr>
+          <w:trHeight w:val="300"/>
+        </w:trPr>
+        <w:tc>
+          <w:tcPr>
+            <w:tcW w:w="1760" w:type="dxa"/>
+            <w:tcBorders>
+              <w:top w:val="nil"/>
+              <w:left w:val="single" w:sz="4" w:space="0" w:color="auto"/>
+              <w:bottom w:val="single" w:sz="4" w:space="0" w:color="auto"/>
+              <w:right w:val="single" w:sz="4" w:space="0" w:color="auto"/>
+            </w:tcBorders>
+            <w:shd w:val="clear" w:color="auto" w:fill="auto"/>
+            <w:noWrap/>
+            <w:vAlign w:val="bottom"/>
+            <w:hideMark/>
+          </w:tcPr>
+          <w:p>
+            <w:pPr>
+              <w:spacing w:after="0" w:line="240" w:lineRule="auto"/>
+              <w:jc w:val="both"/>
+              <w:rPr>
+                <w:rFonts w:ascii="Calibri" w:eastAsia="Times New Roman" w:hAnsi="Calibri" w:cs="Calibri"/>
+                <w:color w:val="000000"/>
+                <w:kern w:val="0"/>
+                <w:sz w:val="22"/>
+                <w:szCs w:val="22"/>
+                <w:lang w:eastAsia="es-CO"/>
+                <w14:ligatures w14:val="none"/>
+              </w:rPr>
+            </w:pPr>
+            <w:r>
+              <w:rPr>
+                <w:rFonts w:ascii="Calibri" w:eastAsia="Times New Roman" w:hAnsi="Calibri" w:cs="Calibri"/>
+                <w:color w:val="000000"/>
+                <w:kern w:val="0"/>
+                <w:sz w:val="22"/>
+                <w:szCs w:val="22"/>
+                <w:lang w:eastAsia="es-CO"/>
+                <w14:ligatures w14:val="none"/>
+              </w:rPr>
+              <w:t>Estacionalidad</w:t>
+            </w:r>
+          </w:p>
+        </w:tc>
+        <w:tc>
+          <w:tcPr>
+            <w:tcW w:w="960" w:type="dxa"/>
+            <w:tcBorders>
+              <w:top w:val="nil"/>
+              <w:left w:val="nil"/>
+              <w:bottom w:val="single" w:sz="4" w:space="0" w:color="auto"/>
+              <w:right w:val="single" w:sz="4" w:space="0" w:color="auto"/>
+            </w:tcBorders>
+            <w:shd w:val="clear" w:color="auto" w:fill="auto"/>
+            <w:noWrap/>
+            <w:vAlign w:val="bottom"/>
+            <w:hideMark/>
+          </w:tcPr>
+          <w:p>
+            <w:pPr>
+              <w:spacing w:after="0" w:line="240" w:lineRule="auto"/>
+              <w:jc w:val="both"/>
+              <w:rPr>
+                <w:rFonts w:ascii="Calibri" w:eastAsia="Times New Roman" w:hAnsi="Calibri" w:cs="Calibri"/>
+                <w:color w:val="000000"/>
+                <w:kern w:val="0"/>
+                <w:sz w:val="22"/>
+                <w:szCs w:val="22"/>
+                <w:lang w:eastAsia="es-CO"/>
+                <w14:ligatures w14:val="none"/>
+              </w:rPr>
+            </w:pPr>
+            <w:r>
+              <w:rPr>
+                <w:rFonts w:ascii="Calibri" w:eastAsia="Times New Roman" w:hAnsi="Calibri" w:cs="Calibri"/>
+                <w:color w:val="000000"/>
+                <w:kern w:val="0"/>
+                <w:sz w:val="22"/>
+                <w:szCs w:val="22"/>
+                <w:lang w:eastAsia="es-CO"/>
+                <w14:ligatures w14:val="none"/>
+              </w:rPr>
+              <w:t>1685.76</w:t>
+            </w:r>
+          </w:p>
+        </w:tc>
+        <w:tc>
+          <w:tcPr>
+            <w:tcW w:w="1670" w:type="dxa"/>
+            <w:tcBorders>
+              <w:top w:val="nil"/>
+              <w:left w:val="nil"/>
+              <w:bottom w:val="single" w:sz="4" w:space="0" w:color="auto"/>
+              <w:right w:val="single" w:sz="4" w:space="0" w:color="auto"/>
+            </w:tcBorders>
+            <w:shd w:val="clear" w:color="auto" w:fill="auto"/>
+            <w:noWrap/>
+            <w:vAlign w:val="bottom"/>
+            <w:hideMark/>
+          </w:tcPr>
+          <w:p>
+            <w:pPr>
+              <w:spacing w:after="0" w:line="240" w:lineRule="auto"/>
+              <w:jc w:val="both"/>
+              <w:rPr>
+                <w:rFonts w:ascii="Calibri" w:eastAsia="Times New Roman" w:hAnsi="Calibri" w:cs="Calibri"/>
+                <w:color w:val="000000"/>
+                <w:kern w:val="0"/>
+                <w:sz w:val="22"/>
+                <w:szCs w:val="22"/>
+                <w:lang w:eastAsia="es-CO"/>
+                <w14:ligatures w14:val="none"/>
+              </w:rPr>
+            </w:pPr>
+            <w:r>
+              <w:rPr>
+                <w:rFonts w:ascii="Calibri" w:eastAsia="Times New Roman" w:hAnsi="Calibri" w:cs="Calibri"/>
+                <w:color w:val="000000"/>
+                <w:kern w:val="0"/>
+                <w:sz w:val="22"/>
+                <w:szCs w:val="22"/>
+                <w:lang w:eastAsia="es-CO"/>
+                <w14:ligatures w14:val="none"/>
+              </w:rPr>
+              <w:t> </w:t>
+            </w:r>
+          </w:p>
+        </w:tc>
+      </w:tr>
+      <w:tr>
+        <w:trPr>
+          <w:trHeight w:val="300"/>
+        </w:trPr>
+        <w:tc>
+          <w:tcPr>
+            <w:tcW w:w="1760" w:type="dxa"/>
+            <w:tcBorders>
+              <w:top w:val="nil"/>
+              <w:left w:val="single" w:sz="4" w:space="0" w:color="auto"/>
+              <w:bottom w:val="single" w:sz="4" w:space="0" w:color="auto"/>
+              <w:right w:val="single" w:sz="4" w:space="0" w:color="auto"/>
+            </w:tcBorders>
+            <w:shd w:val="clear" w:color="auto" w:fill="auto"/>
+            <w:noWrap/>
+            <w:vAlign w:val="bottom"/>
+            <w:hideMark/>
+          </w:tcPr>
+          <w:p>
+            <w:pPr>
+              <w:spacing w:after="0" w:line="240" w:lineRule="auto"/>
+              <w:jc w:val="both"/>
+              <w:rPr>
+                <w:rFonts w:ascii="Calibri" w:eastAsia="Times New Roman" w:hAnsi="Calibri" w:cs="Calibri"/>
+                <w:color w:val="000000"/>
+                <w:kern w:val="0"/>
+                <w:sz w:val="22"/>
+                <w:szCs w:val="22"/>
+                <w:lang w:eastAsia="es-CO"/>
+                <w14:ligatures w14:val="none"/>
+              </w:rPr>
+            </w:pPr>
+            <w:r>
+              <w:rPr>
+                <w:rFonts w:ascii="Calibri" w:eastAsia="Times New Roman" w:hAnsi="Calibri" w:cs="Calibri"/>
+                <w:color w:val="000000"/>
+                <w:kern w:val="0"/>
+                <w:sz w:val="22"/>
+                <w:szCs w:val="22"/>
+                <w:lang w:eastAsia="es-CO"/>
+                <w14:ligatures w14:val="none"/>
+              </w:rPr>
+              <w:t xml:space="preserve">Lineal </w:t>
+            </w:r>
+          </w:p>
+        </w:tc>
+        <w:tc>
+          <w:tcPr>
+            <w:tcW w:w="960" w:type="dxa"/>
+            <w:tcBorders>
+              <w:top w:val="nil"/>
+              <w:left w:val="nil"/>
+              <w:bottom w:val="single" w:sz="4" w:space="0" w:color="auto"/>
+              <w:right w:val="single" w:sz="4" w:space="0" w:color="auto"/>
+            </w:tcBorders>
+            <w:shd w:val="clear" w:color="auto" w:fill="auto"/>
+            <w:noWrap/>
+            <w:vAlign w:val="bottom"/>
+            <w:hideMark/>
+          </w:tcPr>
+          <w:p>
+            <w:pPr>
+              <w:spacing w:after="0" w:line="240" w:lineRule="auto"/>
+              <w:jc w:val="both"/>
+              <w:rPr>
+                <w:rFonts w:ascii="Calibri" w:eastAsia="Times New Roman" w:hAnsi="Calibri" w:cs="Calibri"/>
+                <w:color w:val="000000"/>
+                <w:kern w:val="0"/>
+                <w:sz w:val="22"/>
+                <w:szCs w:val="22"/>
+                <w:lang w:eastAsia="es-CO"/>
+                <w14:ligatures w14:val="none"/>
+              </w:rPr>
+            </w:pPr>
+            <w:r>
+              <w:rPr>
+                <w:rFonts w:ascii="Calibri" w:eastAsia="Times New Roman" w:hAnsi="Calibri" w:cs="Calibri"/>
+                <w:color w:val="000000"/>
+                <w:kern w:val="0"/>
+                <w:sz w:val="22"/>
+                <w:szCs w:val="22"/>
+                <w:lang w:eastAsia="es-CO"/>
+                <w14:ligatures w14:val="none"/>
+              </w:rPr>
+              <w:t>725.52</w:t>
+            </w:r>
+          </w:p>
+        </w:tc>
+        <w:tc>
+          <w:tcPr>
+            <w:tcW w:w="1670" w:type="dxa"/>
+            <w:tcBorders>
+              <w:top w:val="nil"/>
+              <w:left w:val="nil"/>
+              <w:bottom w:val="single" w:sz="4" w:space="0" w:color="auto"/>
+              <w:right w:val="single" w:sz="4" w:space="0" w:color="auto"/>
+            </w:tcBorders>
+            <w:shd w:val="clear" w:color="auto" w:fill="auto"/>
+            <w:noWrap/>
+            <w:vAlign w:val="bottom"/>
+            <w:hideMark/>
+          </w:tcPr>
+          <w:p>
+            <w:pPr>
+              <w:spacing w:after="0" w:line="240" w:lineRule="auto"/>
+              <w:jc w:val="both"/>
+              <w:rPr>
+                <w:rFonts w:ascii="Calibri" w:eastAsia="Times New Roman" w:hAnsi="Calibri" w:cs="Calibri"/>
+                <w:color w:val="000000"/>
+                <w:kern w:val="0"/>
+                <w:sz w:val="22"/>
+                <w:szCs w:val="22"/>
+                <w:lang w:eastAsia="es-CO"/>
+                <w14:ligatures w14:val="none"/>
+              </w:rPr>
+            </w:pPr>
+            <w:r>
+              <w:rPr>
+                <w:rFonts w:ascii="Calibri" w:eastAsia="Times New Roman" w:hAnsi="Calibri" w:cs="Calibri"/>
+                <w:color w:val="000000"/>
+                <w:kern w:val="0"/>
+                <w:sz w:val="22"/>
+                <w:szCs w:val="22"/>
+                <w:lang w:eastAsia="es-CO"/>
+                <w14:ligatures w14:val="none"/>
+              </w:rPr>
+              <w:t> </w:t>
+            </w:r>
+          </w:p>
+        </w:tc>
+      </w:tr>
+      <w:tr>
+        <w:trPr>
+          <w:trHeight w:val="300"/>
+        </w:trPr>
+        <w:tc>
+          <w:tcPr>
+            <w:tcW w:w="1760" w:type="dxa"/>
+            <w:tcBorders>
+              <w:top w:val="nil"/>
+              <w:left w:val="single" w:sz="4" w:space="0" w:color="auto"/>
+              <w:bottom w:val="single" w:sz="4" w:space="0" w:color="auto"/>
+              <w:right w:val="single" w:sz="4" w:space="0" w:color="auto"/>
+            </w:tcBorders>
+            <w:shd w:val="clear" w:color="auto" w:fill="auto"/>
+            <w:noWrap/>
+            <w:vAlign w:val="bottom"/>
+            <w:hideMark/>
+          </w:tcPr>
+          <w:p>
+            <w:pPr>
+              <w:spacing w:after="0" w:line="240" w:lineRule="auto"/>
+              <w:jc w:val="both"/>
+              <w:rPr>
+                <w:rFonts w:ascii="Calibri" w:eastAsia="Times New Roman" w:hAnsi="Calibri" w:cs="Calibri"/>
+                <w:color w:val="000000"/>
+                <w:kern w:val="0"/>
+                <w:sz w:val="22"/>
+                <w:szCs w:val="22"/>
+                <w:lang w:eastAsia="es-CO"/>
+                <w14:ligatures w14:val="none"/>
+              </w:rPr>
+            </w:pPr>
+            <w:r>
+              <w:rPr>
+                <w:rFonts w:ascii="Calibri" w:eastAsia="Times New Roman" w:hAnsi="Calibri" w:cs="Calibri"/>
+                <w:color w:val="000000"/>
+                <w:kern w:val="0"/>
+                <w:sz w:val="22"/>
+                <w:szCs w:val="22"/>
+                <w:lang w:eastAsia="es-CO"/>
+                <w14:ligatures w14:val="none"/>
+              </w:rPr>
+              <w:t>Cuadrado</w:t>
+            </w:r>
+          </w:p>
+        </w:tc>
+        <w:tc>
+          <w:tcPr>
+            <w:tcW w:w="960" w:type="dxa"/>
+            <w:tcBorders>
+              <w:top w:val="nil"/>
+              <w:left w:val="nil"/>
+              <w:bottom w:val="single" w:sz="4" w:space="0" w:color="auto"/>
+              <w:right w:val="single" w:sz="4" w:space="0" w:color="auto"/>
+            </w:tcBorders>
+            <w:shd w:val="clear" w:color="auto" w:fill="auto"/>
+            <w:noWrap/>
+            <w:vAlign w:val="bottom"/>
+            <w:hideMark/>
+          </w:tcPr>
+          <w:p>
+            <w:pPr>
+              <w:spacing w:after="0" w:line="240" w:lineRule="auto"/>
+              <w:jc w:val="both"/>
+              <w:rPr>
+                <w:rFonts w:ascii="Calibri" w:eastAsia="Times New Roman" w:hAnsi="Calibri" w:cs="Calibri"/>
+                <w:color w:val="000000"/>
+                <w:kern w:val="0"/>
+                <w:sz w:val="22"/>
+                <w:szCs w:val="22"/>
+                <w:lang w:eastAsia="es-CO"/>
+                <w14:ligatures w14:val="none"/>
+              </w:rPr>
+            </w:pPr>
+            <w:r>
+              <w:rPr>
+                <w:rFonts w:ascii="Calibri" w:eastAsia="Times New Roman" w:hAnsi="Calibri" w:cs="Calibri"/>
+                <w:color w:val="000000"/>
+                <w:kern w:val="0"/>
+                <w:sz w:val="22"/>
+                <w:szCs w:val="22"/>
+                <w:lang w:eastAsia="es-CO"/>
+                <w14:ligatures w14:val="none"/>
+              </w:rPr>
+              <w:t>632.47</w:t>
+            </w:r>
+          </w:p>
+        </w:tc>
+        <w:tc>
+          <w:tcPr>
+            <w:tcW w:w="1670" w:type="dxa"/>
+            <w:tcBorders>
+              <w:top w:val="nil"/>
+              <w:left w:val="nil"/>
+              <w:bottom w:val="single" w:sz="4" w:space="0" w:color="auto"/>
+              <w:right w:val="single" w:sz="4" w:space="0" w:color="auto"/>
+            </w:tcBorders>
+            <w:shd w:val="clear" w:color="auto" w:fill="auto"/>
+            <w:noWrap/>
+            <w:vAlign w:val="bottom"/>
+            <w:hideMark/>
+          </w:tcPr>
+          <w:p>
+            <w:pPr>
+              <w:spacing w:after="0" w:line="240" w:lineRule="auto"/>
+              <w:jc w:val="both"/>
+              <w:rPr>
+                <w:rFonts w:ascii="Calibri" w:eastAsia="Times New Roman" w:hAnsi="Calibri" w:cs="Calibri"/>
+                <w:color w:val="000000"/>
+                <w:kern w:val="0"/>
+                <w:sz w:val="22"/>
+                <w:szCs w:val="22"/>
+                <w:lang w:eastAsia="es-CO"/>
+                <w14:ligatures w14:val="none"/>
+              </w:rPr>
+            </w:pPr>
+            <w:r>
+              <w:rPr>
+                <w:rFonts w:ascii="Calibri" w:eastAsia="Times New Roman" w:hAnsi="Calibri" w:cs="Calibri"/>
+                <w:color w:val="000000"/>
+                <w:kern w:val="0"/>
+                <w:sz w:val="22"/>
+                <w:szCs w:val="22"/>
+                <w:lang w:eastAsia="es-CO"/>
+                <w14:ligatures w14:val="none"/>
+              </w:rPr>
+              <w:t> </w:t>
+            </w:r>
+          </w:p>
+        </w:tc>
+      </w:tr>
+      <w:tr>
+        <w:trPr>
+          <w:trHeight w:val="300"/>
+        </w:trPr>
+        <w:tc>
+          <w:tcPr>
+            <w:tcW w:w="1760" w:type="dxa"/>
+            <w:tcBorders>
+              <w:top w:val="nil"/>
+              <w:left w:val="single" w:sz="4" w:space="0" w:color="auto"/>
+              <w:bottom w:val="single" w:sz="4" w:space="0" w:color="auto"/>
+              <w:right w:val="single" w:sz="4" w:space="0" w:color="auto"/>
+            </w:tcBorders>
+            <w:shd w:val="clear" w:color="auto" w:fill="auto"/>
+            <w:noWrap/>
+            <w:vAlign w:val="bottom"/>
+            <w:hideMark/>
+          </w:tcPr>
+          <w:p>
+            <w:pPr>
+              <w:spacing w:after="0" w:line="240" w:lineRule="auto"/>
+              <w:jc w:val="both"/>
+              <w:rPr>
+                <w:rFonts w:ascii="Calibri" w:eastAsia="Times New Roman" w:hAnsi="Calibri" w:cs="Calibri"/>
+                <w:color w:val="000000"/>
+                <w:kern w:val="0"/>
+                <w:sz w:val="22"/>
+                <w:szCs w:val="22"/>
+                <w:lang w:eastAsia="es-CO"/>
+                <w14:ligatures w14:val="none"/>
+              </w:rPr>
+            </w:pPr>
+            <w:r>
+              <w:rPr>
+                <w:rFonts w:ascii="Calibri" w:eastAsia="Times New Roman" w:hAnsi="Calibri" w:cs="Calibri"/>
+                <w:color w:val="000000"/>
+                <w:kern w:val="0"/>
+                <w:sz w:val="22"/>
+                <w:szCs w:val="22"/>
+                <w:lang w:eastAsia="es-CO"/>
+                <w14:ligatures w14:val="none"/>
+              </w:rPr>
+              <w:t>Cubica</w:t>
+            </w:r>
+          </w:p>
+        </w:tc>
+        <w:tc>
+          <w:tcPr>
+            <w:tcW w:w="960" w:type="dxa"/>
+            <w:tcBorders>
+              <w:top w:val="nil"/>
+              <w:left w:val="nil"/>
+              <w:bottom w:val="single" w:sz="4" w:space="0" w:color="auto"/>
+              <w:right w:val="single" w:sz="4" w:space="0" w:color="auto"/>
+            </w:tcBorders>
+            <w:shd w:val="clear" w:color="auto" w:fill="auto"/>
+            <w:noWrap/>
+            <w:vAlign w:val="bottom"/>
+            <w:hideMark/>
+          </w:tcPr>
+          <w:p>
+            <w:pPr>
+              <w:spacing w:after="0" w:line="240" w:lineRule="auto"/>
+              <w:jc w:val="both"/>
+              <w:rPr>
+                <w:rFonts w:ascii="Calibri" w:eastAsia="Times New Roman" w:hAnsi="Calibri" w:cs="Calibri"/>
+                <w:color w:val="000000"/>
+                <w:kern w:val="0"/>
+                <w:sz w:val="22"/>
+                <w:szCs w:val="22"/>
+                <w:lang w:eastAsia="es-CO"/>
+                <w14:ligatures w14:val="none"/>
+              </w:rPr>
+            </w:pPr>
+            <w:r>
+              <w:rPr>
+                <w:rFonts w:ascii="Calibri" w:eastAsia="Times New Roman" w:hAnsi="Calibri" w:cs="Calibri"/>
+                <w:color w:val="000000"/>
+                <w:kern w:val="0"/>
+                <w:sz w:val="22"/>
+                <w:szCs w:val="22"/>
+                <w:lang w:eastAsia="es-CO"/>
+                <w14:ligatures w14:val="none"/>
+              </w:rPr>
+              <w:t>238.72</w:t>
+            </w:r>
+          </w:p>
+        </w:tc>
+        <w:tc>
+          <w:tcPr>
+            <w:tcW w:w="1670" w:type="dxa"/>
+            <w:tcBorders>
+              <w:top w:val="nil"/>
+              <w:left w:val="nil"/>
+              <w:bottom w:val="single" w:sz="4" w:space="0" w:color="auto"/>
+              <w:right w:val="single" w:sz="4" w:space="0" w:color="auto"/>
+            </w:tcBorders>
+            <w:shd w:val="clear" w:color="auto" w:fill="auto"/>
+            <w:noWrap/>
+            <w:vAlign w:val="bottom"/>
+            <w:hideMark/>
+          </w:tcPr>
+          <w:p>
+            <w:pPr>
+              <w:spacing w:after="0" w:line="240" w:lineRule="auto"/>
+              <w:jc w:val="both"/>
+              <w:rPr>
+                <w:rFonts w:ascii="Calibri" w:eastAsia="Times New Roman" w:hAnsi="Calibri" w:cs="Calibri"/>
+                <w:color w:val="000000"/>
+                <w:kern w:val="0"/>
+                <w:sz w:val="22"/>
+                <w:szCs w:val="22"/>
+                <w:lang w:eastAsia="es-CO"/>
+                <w14:ligatures w14:val="none"/>
+              </w:rPr>
+            </w:pPr>
+            <w:r>
+              <w:rPr>
+                <w:rFonts w:ascii="Calibri" w:eastAsia="Times New Roman" w:hAnsi="Calibri" w:cs="Calibri"/>
+                <w:color w:val="000000"/>
+                <w:kern w:val="0"/>
+                <w:sz w:val="22"/>
+                <w:szCs w:val="22"/>
+                <w:lang w:eastAsia="es-CO"/>
+                <w14:ligatures w14:val="none"/>
+              </w:rPr>
+              <w:t> </w:t>
+            </w:r>
+          </w:p>
+        </w:tc>
+      </w:tr>
+      <w:tr>
+        <w:trPr>
+          <w:trHeight w:val="300"/>
+        </w:trPr>
+        <w:tc>
+          <w:tcPr>
+            <w:tcW w:w="1760" w:type="dxa"/>
+            <w:tcBorders>
+              <w:top w:val="nil"/>
+              <w:left w:val="single" w:sz="4" w:space="0" w:color="auto"/>
+              <w:bottom w:val="single" w:sz="4" w:space="0" w:color="auto"/>
+              <w:right w:val="single" w:sz="4" w:space="0" w:color="auto"/>
+            </w:tcBorders>
+            <w:shd w:val="clear" w:color="auto" w:fill="auto"/>
+            <w:noWrap/>
+            <w:vAlign w:val="bottom"/>
+            <w:hideMark/>
+          </w:tcPr>
+          <w:p>
+            <w:pPr>
+              <w:spacing w:after="0" w:line="240" w:lineRule="auto"/>
+              <w:jc w:val="both"/>
+              <w:rPr>
+                <w:rFonts w:ascii="Calibri" w:eastAsia="Times New Roman" w:hAnsi="Calibri" w:cs="Calibri"/>
+                <w:color w:val="000000"/>
+                <w:kern w:val="0"/>
+                <w:sz w:val="22"/>
+                <w:szCs w:val="22"/>
+                <w:lang w:eastAsia="es-CO"/>
+                <w14:ligatures w14:val="none"/>
+              </w:rPr>
+            </w:pPr>
+            <w:r>
+              <w:rPr>
+                <w:rFonts w:ascii="Calibri" w:eastAsia="Times New Roman" w:hAnsi="Calibri" w:cs="Calibri"/>
+                <w:color w:val="000000"/>
+                <w:kern w:val="0"/>
+                <w:sz w:val="22"/>
+                <w:szCs w:val="22"/>
+                <w:lang w:eastAsia="es-CO"/>
+                <w14:ligatures w14:val="none"/>
+              </w:rPr>
+              <w:t xml:space="preserve">Cubica + </w:t>
+            </w:r>
+            <w:proofErr w:type="spellStart"/>
+            <w:r>
+              <w:rPr>
+                <w:rFonts w:ascii="Calibri" w:eastAsia="Times New Roman" w:hAnsi="Calibri" w:cs="Calibri"/>
+                <w:color w:val="000000"/>
+                <w:kern w:val="0"/>
+                <w:sz w:val="22"/>
+                <w:szCs w:val="22"/>
+                <w:lang w:eastAsia="es-CO"/>
+                <w14:ligatures w14:val="none"/>
+              </w:rPr>
+              <w:t>est</w:t>
+            </w:r>
+            <w:proofErr w:type="spellEnd"/>
+          </w:p>
+        </w:tc>
+        <w:tc>
+          <w:tcPr>
+            <w:tcW w:w="960" w:type="dxa"/>
+            <w:tcBorders>
+              <w:top w:val="nil"/>
+              <w:left w:val="nil"/>
+              <w:bottom w:val="single" w:sz="4" w:space="0" w:color="auto"/>
+              <w:right w:val="single" w:sz="4" w:space="0" w:color="auto"/>
+            </w:tcBorders>
+            <w:shd w:val="clear" w:color="auto" w:fill="auto"/>
+            <w:noWrap/>
+            <w:vAlign w:val="bottom"/>
+            <w:hideMark/>
+          </w:tcPr>
+          <w:p>
+            <w:pPr>
+              <w:spacing w:after="0" w:line="240" w:lineRule="auto"/>
+              <w:jc w:val="both"/>
+              <w:rPr>
+                <w:rFonts w:ascii="Calibri" w:eastAsia="Times New Roman" w:hAnsi="Calibri" w:cs="Calibri"/>
+                <w:color w:val="000000"/>
+                <w:kern w:val="0"/>
+                <w:sz w:val="22"/>
+                <w:szCs w:val="22"/>
+                <w:lang w:eastAsia="es-CO"/>
+                <w14:ligatures w14:val="none"/>
+              </w:rPr>
+            </w:pPr>
+            <w:r>
+              <w:rPr>
+                <w:rFonts w:ascii="Calibri" w:eastAsia="Times New Roman" w:hAnsi="Calibri" w:cs="Calibri"/>
+                <w:color w:val="000000"/>
+                <w:kern w:val="0"/>
+                <w:sz w:val="22"/>
+                <w:szCs w:val="22"/>
+                <w:lang w:eastAsia="es-CO"/>
+                <w14:ligatures w14:val="none"/>
+              </w:rPr>
+              <w:t>104.61</w:t>
+            </w:r>
+          </w:p>
+        </w:tc>
+        <w:tc>
+          <w:tcPr>
+            <w:tcW w:w="1670" w:type="dxa"/>
+            <w:tcBorders>
+              <w:top w:val="nil"/>
+              <w:left w:val="nil"/>
+              <w:bottom w:val="single" w:sz="4" w:space="0" w:color="auto"/>
+              <w:right w:val="single" w:sz="4" w:space="0" w:color="auto"/>
+            </w:tcBorders>
+            <w:shd w:val="clear" w:color="auto" w:fill="auto"/>
+            <w:noWrap/>
+            <w:vAlign w:val="bottom"/>
+            <w:hideMark/>
+          </w:tcPr>
+          <w:p>
+            <w:pPr>
+              <w:spacing w:after="0" w:line="240" w:lineRule="auto"/>
+              <w:jc w:val="both"/>
+              <w:rPr>
+                <w:rFonts w:ascii="Calibri" w:eastAsia="Times New Roman" w:hAnsi="Calibri" w:cs="Calibri"/>
+                <w:color w:val="000000"/>
+                <w:kern w:val="0"/>
+                <w:sz w:val="22"/>
+                <w:szCs w:val="22"/>
+                <w:lang w:eastAsia="es-CO"/>
+                <w14:ligatures w14:val="none"/>
+              </w:rPr>
+            </w:pPr>
+            <w:r>
+              <w:rPr>
+                <w:rFonts w:ascii="Calibri" w:eastAsia="Times New Roman" w:hAnsi="Calibri" w:cs="Calibri"/>
+                <w:color w:val="000000"/>
+                <w:kern w:val="0"/>
+                <w:sz w:val="22"/>
+                <w:szCs w:val="22"/>
+                <w:lang w:eastAsia="es-CO"/>
+                <w14:ligatures w14:val="none"/>
+              </w:rPr>
+              <w:t> </w:t>
+            </w:r>
+          </w:p>
+        </w:tc>
+      </w:tr>
+    </w:tbl>
+    <w:p>
+      <w:pPr>
+        <w:spacing w:line="240" w:lineRule="auto"/>
+        <w:jc w:val="both"/>
+        <w:rPr>
+          <w:rFonts w:ascii="Calibri" w:hAnsi="Calibri" w:cs="Calibri"/>
+          <w:b/>
+          <w:bCs/>
+          <w:sz w:val="16"/>
+          <w:szCs w:val="16"/>
+        </w:rPr>
+      </w:pPr>
+      <w:r>
+        <w:rPr>
+          <w:rFonts w:ascii="Calibri" w:hAnsi="Calibri" w:cs="Calibri"/>
+          <w:b/>
+          <w:bCs/>
+          <w:sz w:val="16"/>
+          <w:szCs w:val="16"/>
+        </w:rPr>
+        <w:t>Con el fin de verificar la validez estadística del modelo cúbico con componente estacional, se analizan los residuales mediante pruebas de autocorrelación, homocedasticidad y normalidad, evaluando así el cumplimiento de los principales supuestos del modelo.</w:t>
+      </w:r>
+    </w:p>
+    <w:p>
+      <w:pPr>
+        <w:spacing w:line="240" w:lineRule="auto"/>
+        <w:jc w:val="both"/>
+        <w:rPr>
+          <w:rFonts w:ascii="Calibri" w:hAnsi="Calibri" w:cs="Calibri"/>
+          <w:sz w:val="16"/>
+          <w:szCs w:val="16"/>
+        </w:rPr>
+      </w:pPr>
+      <w:r>
+        <w:rPr>
+          <w:rFonts w:ascii="Calibri" w:hAnsi="Calibri" w:cs="Calibri"/>
+          <w:sz w:val="16"/>
+          <w:szCs w:val="16"/>
+        </w:rPr>
+        <w:drawing>
+          <wp:anchor distT="0" distB="0" distL="114300" distR="114300" simplePos="0" relativeHeight="251659264" behindDoc="0" locked="0" layoutInCell="1" allowOverlap="1" wp14:anchorId="069F9849" wp14:editId="1ABB3828">
+            <wp:simplePos x="0" y="0"/>
+            <wp:positionH relativeFrom="column">
+              <wp:posOffset>8890</wp:posOffset>
+            </wp:positionH>
+            <wp:positionV relativeFrom="paragraph">
+              <wp:posOffset>161554</wp:posOffset>
+            </wp:positionV>
+            <wp:extent cx="2106295" cy="1492250"/>
+            <wp:effectExtent l="0" t="0" r="8255" b="0"/>
+            <wp:wrapThrough wrapText="bothSides">
+              <wp:wrapPolygon edited="0">
+                <wp:start x="0" y="0"/>
+                <wp:lineTo x="0" y="21232"/>
+                <wp:lineTo x="21489" y="21232"/>
+                <wp:lineTo x="21489" y="0"/>
+                <wp:lineTo x="0" y="0"/>
+              </wp:wrapPolygon>
+            </wp:wrapThrough>
+            <wp:docPr id="963855605" name="Picture 1" descr="A graph with blue lines&#10;&#10;Description automatically generated"/>
+            <wp:cNvGraphicFramePr>
+              <a:graphicFrameLocks xmlns:a="http://schemas.openxmlformats.org/drawingml/2006/main" noChangeAspect="1"/>
+            </wp:cNvGraphicFramePr>
+            <a:graphic xmlns:a="http://schemas.openxmlformats.org/drawingml/2006/main">
+              <a:graphicData uri="http://schemas.openxmlformats.org/drawingml/2006/picture">
+                <pic:pic xmlns:pic="http://schemas.openxmlformats.org/drawingml/2006/picture">
+                  <pic:nvPicPr>
+                    <pic:cNvPr id="963855605" name="Picture 1" descr="A graph with blue lines&#10;&#10;Description automatically generated"/>
+                    <pic:cNvPicPr/>
+                  </pic:nvPicPr>
+                  <pic:blipFill>
+                    <a:blip r:embed="rId10" cstate="print">
+                      <a:extLst>
+                        <a:ext uri="{28A0092B-C50C-407E-A947-70E740481C1C}">
+                          <a14:useLocalDpi xmlns:a14="http://schemas.microsoft.com/office/drawing/2010/main" val="0"/>
+                        </a:ext>
+                      </a:extLst>
+                    </a:blip>
+                    <a:stretch>
+                      <a:fillRect/>
+                    </a:stretch>
+                  </pic:blipFill>
+                  <pic:spPr>
+                    <a:xfrm>
+                      <a:off x="0" y="0"/>
+                      <a:ext cx="2106295" cy="1492250"/>
+                    </a:xfrm>
+                    <a:prstGeom prst="rect">
+                      <a:avLst/>
+                    </a:prstGeom>
+                  </pic:spPr>
+                </pic:pic>
+              </a:graphicData>
+            </a:graphic>
+          </wp:anchor>
+        </w:drawing>
+      </w:r>
+    </w:p>
+    <w:p>
+      <w:pPr>
+        <w:spacing w:line="240" w:lineRule="auto"/>
+        <w:jc w:val="both"/>
+        <w:rPr>
+          <w:rFonts w:ascii="Calibri" w:hAnsi="Calibri" w:cs="Calibri"/>
+          <w:sz w:val="16"/>
+          <w:szCs w:val="16"/>
+        </w:rPr>
+      </w:pPr>
+      <w:r>
+        <w:rPr>
+          <w:rFonts w:ascii="Calibri" w:hAnsi="Calibri" w:cs="Calibri"/>
+          <w:sz w:val="16"/>
+          <w:szCs w:val="16"/>
+        </w:rPr>
+        <w:t xml:space="preserve">Se realizaron varias pruebas de autocorrelación y todas indicaban que si hay autocorrelaciones residuales y fue rechazada la hipótesis nula. </w:t>
+      </w:r>
+    </w:p>
+    <w:p>
+      <w:pPr>
+        <w:spacing w:line="240" w:lineRule="auto"/>
+        <w:jc w:val="both"/>
+        <w:rPr>
+          <w:rFonts w:ascii="Calibri" w:hAnsi="Calibri" w:cs="Calibri"/>
+          <w:sz w:val="16"/>
+          <w:szCs w:val="16"/>
+        </w:rPr>
+      </w:pPr>
+      <w:r>
+        <w:rPr>
+          <w:rFonts w:ascii="Calibri" w:hAnsi="Calibri" w:cs="Calibri"/>
+          <w:sz w:val="16"/>
+          <w:szCs w:val="16"/>
+        </w:rPr>
+        <w:t xml:space="preserve">Se realizo la prueba </w:t>
       </w:r>
       <w:proofErr w:type="spellStart"/>
       <w:r>
@@ -972,7 +1654,7 @@
           <w:sz w:val="16"/>
           <w:szCs w:val="16"/>
         </w:rPr>
-        <w:t>holt-winters</w:t>
+        <w:t>Ljung</w:t>
       </w:r>
       <w:proofErr w:type="spellEnd"/>
       <w:r>
@@ -981,14 +1663,85 @@
           <w:sz w:val="16"/>
           <w:szCs w:val="16"/>
         </w:rPr>
-        <w:t xml:space="preserve"> suponen existencia de tendencia, estacionalidad y que el futuro será parecido, si la serie llegara a cambiar abruptamente como en algunos casos lo hace la banca, acciones y/o cambios como crisis o pandemia el suavizamiento podría quedarse limitado</w:t>
-      </w:r>
+        <w:t xml:space="preserve">-Box </w:t>
+      </w:r>
+      <w:r>
+        <w:rPr>
+          <w:rFonts w:ascii="Calibri" w:hAnsi="Calibri" w:cs="Calibri"/>
+          <w:sz w:val="16"/>
+          <w:szCs w:val="16"/>
+        </w:rPr>
+        <w:t>y fue rechazada</w:t>
+      </w:r>
+      <w:r>
+        <w:rPr>
+          <w:rFonts w:ascii="Calibri" w:hAnsi="Calibri" w:cs="Calibri"/>
+          <w:sz w:val="16"/>
+          <w:szCs w:val="16"/>
+        </w:rPr>
+        <w:t xml:space="preserve"> la homocedasticidad, es decir que la varianza no es constante.</w:t>
+      </w:r>
+      <w:r>
+        <w:rPr>
+          <w:rFonts w:ascii="Calibri" w:hAnsi="Calibri" w:cs="Calibri"/>
+          <w:sz w:val="16"/>
+          <w:szCs w:val="16"/>
+        </w:rPr>
+        <w:t xml:space="preserve"> </w:t>
+      </w:r>
+    </w:p>
+    <w:p>
+      <w:pPr>
+        <w:spacing w:line="240" w:lineRule="auto"/>
+        <w:jc w:val="both"/>
+        <w:rPr>
+          <w:rFonts w:ascii="Calibri" w:hAnsi="Calibri" w:cs="Calibri"/>
+          <w:sz w:val="16"/>
+          <w:szCs w:val="16"/>
+        </w:rPr>
+      </w:pPr>
+      <w:r>
+        <w:rPr>
+          <w:rFonts w:ascii="Calibri" w:hAnsi="Calibri" w:cs="Calibri"/>
+          <w:sz w:val="16"/>
+          <w:szCs w:val="16"/>
+        </w:rPr>
+        <w:t xml:space="preserve">Se aplico la prueba Shapiro-Wilk y Jarque </w:t>
+      </w:r>
+      <w:proofErr w:type="spellStart"/>
+      <w:r>
+        <w:rPr>
+          <w:rFonts w:ascii="Calibri" w:hAnsi="Calibri" w:cs="Calibri"/>
+          <w:sz w:val="16"/>
+          <w:szCs w:val="16"/>
+        </w:rPr>
+        <w:t>Bera</w:t>
+      </w:r>
+      <w:proofErr w:type="spellEnd"/>
+      <w:r>
+        <w:rPr>
+          <w:rFonts w:ascii="Calibri" w:hAnsi="Calibri" w:cs="Calibri"/>
+          <w:sz w:val="16"/>
+          <w:szCs w:val="16"/>
+        </w:rPr>
+        <w:t xml:space="preserve"> para la normalidad en donde la fue comprobado que los residuales cumplen con la normalidad.</w:t>
+      </w:r>
+    </w:p>
+    <w:p>
+      <w:pPr>
+        <w:spacing w:line="240" w:lineRule="auto"/>
+        <w:jc w:val="both"/>
+        <w:rPr>
+          <w:rFonts w:ascii="Calibri" w:hAnsi="Calibri" w:cs="Calibri"/>
+          <w:sz w:val="16"/>
+          <w:szCs w:val="16"/>
+        </w:rPr>
+      </w:pPr>
     </w:p>
     <w:p/>
     <w:p/>
-    <w:p/>
     <w:sectPr>
-      <w:headerReference w:type="default" r:id="rId9"/>
+      <w:headerReference w:type="default" r:id="rId11"/>
       <w:pgSz w:w="12240" w:h="15840"/>
       <w:pgMar w:top="720" w:right="720" w:bottom="720" w:left="397" w:header="720" w:footer="720" w:gutter="0"/>
       <w:cols w:num="2" w:sep="1" w:space="221"/>
@@ -1144,10 +1897,7 @@
       <w:tab/>
     </w:r>
     <w:r>
-      <w:t xml:space="preserve">Jefferson </w:t>
-    </w:r>
-    <w:r>
-      <w:t>Martínez</w:t>
+      <w:t>Jefferson Martínez</w:t>
     </w:r>
   </w:p>
   <w:p>
@@ -2476,4 +3226,16 @@
     </a:ext>
   </a:extLst>
 </a:theme>
+</file>
+
+<file path=customXml/item1.xml><?xml version="1.0" encoding="utf-8"?>
+<b:Sources xmlns:b="http://schemas.openxmlformats.org/officeDocument/2006/bibliography" xmlns="http://schemas.openxmlformats.org/officeDocument/2006/bibliography" SelectedStyle="\APASixthEditionOfficeOnline.xsl" StyleName="APA" Version="6"/>
+</file>
+
+<file path=customXml/itemProps1.xml><?xml version="1.0" encoding="utf-8"?>
+<ds:datastoreItem xmlns:ds="http://schemas.openxmlformats.org/officeDocument/2006/customXml" ds:itemID="{F0AC55FE-37F2-417B-A52D-B4CE5FF68CB5}">
+  <ds:schemaRefs>
+    <ds:schemaRef ds:uri="http://schemas.openxmlformats.org/officeDocument/2006/bibliography"/>
+  </ds:schemaRefs>
+</ds:datastoreItem>
 </file>
</xml_diff>